<commit_message>
Molecules: renumber SI tables to the S-series (Table S1..S29)
The SI tables inherited the long-form preprint's appendix lettering (A.1, B.1a,
C.1b, D.4b, ...), which is non-standard and confusing. build_molecules_html.py
now renumbers them to a clean Supplementary series (Table S1, S2, ...) in
physical order and rewrites every reference in BOTH the main text and the SI
(single, list, and range forms). Verified: 29 captions S1-S29, 0 dangling refs,
0 leftover lettered table labels; Supplementary Section labels (A-F) unchanged.
The long-form preprint keeps its Appendix A-F numbering.

Co-Authored-By: Claude Opus 4.8 <noreply@anthropic.com>
</commit_message>
<xml_diff>
--- a/paper/molecules/molecules_paper.docx
+++ b/paper/molecules/molecules_paper.docx
@@ -3258,7 +3258,7 @@
         <w:t xml:space="preserve"> </w:t>
       </w:r>
       <w:r>
-        <w:t xml:space="preserve">40k per denoiser, alpha-anneal disabled) are documented in Section 4.15 and Supplementary Section B.5 (Table B.5) and are not re-derived here.</w:t>
+        <w:t xml:space="preserve">40k per denoiser, alpha-anneal disabled) are documented in Section 4.15 and Supplementary Section B.5 (Table S5) and are not re-derived here.</w:t>
       </w:r>
     </w:p>
     <w:p>
@@ -4442,7 +4442,7 @@
         <w:t xml:space="preserve"> </w:t>
       </w:r>
       <w:r>
-        <w:t xml:space="preserve">for ranking; (ii) population residual branch (Table C.4): K-J on raw experimental</w:t>
+        <w:t xml:space="preserve">for ranking; (ii) population residual branch (Table S12): K-J on raw experimental</w:t>
       </w:r>
       <w:r>
         <w:t xml:space="preserve"> </w:t>
@@ -5027,7 +5027,7 @@
         <w:t xml:space="preserve"> </w:t>
       </w:r>
       <w:r>
-        <w:t xml:space="preserve">(575-row Tier-A pool, see Table C.4).</w:t>
+        <w:t xml:space="preserve">(575-row Tier-A pool, see Table S12).</w:t>
       </w:r>
     </w:p>
     <w:p>
@@ -17563,7 +17563,7 @@
         <w:t xml:space="preserve"> </w:t>
       </w:r>
       <w:r>
-        <w:t xml:space="preserve">from Table C.1b; baselines from Table 7.</w:t>
+        <w:t xml:space="preserve">from Table S7; baselines from Table 7.</w:t>
       </w:r>
     </w:p>
     <w:p>
@@ -17607,7 +17607,7 @@
         </m:r>
       </m:oMath>
       <w:r>
-        <w:t xml:space="preserve">-axis is the higher-is-better Stage-1+2 reranker success score (range 0–1), not the lower-is-better Pareto-reranker penalty tabulated in Table 7, Figure 6, and Table F.4. Cross-figure ranking is consistent (DGLD Hz-C2 best on both) but absolute values are not comparable.</w:t>
+        <w:t xml:space="preserve">-axis is the higher-is-better Stage-1+2 reranker success score (range 0–1), not the lower-is-better Pareto-reranker penalty tabulated in Table 7, Figure 6, and Table S27. Cross-figure ranking is consistent (DGLD Hz-C2 best on both) but absolute values are not comparable.</w:t>
       </w:r>
     </w:p>
     <w:p>
@@ -19150,7 +19150,7 @@
         <w:t xml:space="preserve"> </w:t>
       </w:r>
       <w:r>
-        <w:t xml:space="preserve">Per-condition seed variance (3-seed s.d. on top-1 composite, range 0.106–0.184) is comparable to the across-condition mean differences, so the production C2 default is justified by the most-novel result rather than a sharp performance lift; the qualitative ablation conclusions are robust to seed across all six guidance axes (Table F.4, full multi-seed table). The 6-seed unguided baseline gives the tightest mean (top-1 composite 0.451 ± 0.126); the SA-axis SA-C3 (viab+sens+SA) is the worst at 0.698 ± 0.015.</w:t>
+        <w:t xml:space="preserve">Per-condition seed variance (3-seed s.d. on top-1 composite, range 0.106–0.184) is comparable to the across-condition mean differences, so the production C2 default is justified by the most-novel result rather than a sharp performance lift; the qualitative ablation conclusions are robust to seed across all six guidance axes (Table S27, full multi-seed table). The 6-seed unguided baseline gives the tightest mean (top-1 composite 0.451 ± 0.126); the SA-axis SA-C3 (viab+sens+SA) is the worst at 0.698 ± 0.015.</w:t>
       </w:r>
     </w:p>
     <w:p>
@@ -21714,7 +21714,7 @@
         <w:t xml:space="preserve">2</w:t>
       </w:r>
       <w:r>
-        <w:t xml:space="preserve">); the decoder mirrors this with Linear(1024→1000)–BN–ReLU–Linear(1000→1000)–BN–ReLU–Linear(1000→2000)–ReLU–Linear(2000→72·108) and produces a (B, 72, 108) log-probability tensor in parallel (no autoregression). Layer-by-layer widths and parameter counts are in Table B.1a. We fine-tune all parameters for</w:t>
+        <w:t xml:space="preserve">); the decoder mirrors this with Linear(1024→1000)–BN–ReLU–Linear(1000→1000)–BN–ReLU–Linear(1000→2000)–ReLU–Linear(2000→72·108) and produces a (B, 72, 108) log-probability tensor in parallel (no autoregression). Layer-by-layer widths and parameter counts are in Table S2. We fine-tune all parameters for</w:t>
       </w:r>
       <w:r>
         <w:t xml:space="preserve"> </w:t>
@@ -22260,7 +22260,7 @@
         <w:t xml:space="preserve"> </w:t>
       </w:r>
       <w:r>
-        <w:t xml:space="preserve">consumed by Figure 16 (Denoiser training) and Figures 17, 19 (Labeling, Self-distillation). Hyperparameters in Table B.1a.</w:t>
+        <w:t xml:space="preserve">consumed by Figure 16 (Denoiser training) and Figures 17, 19 (Labeling, Self-distillation). Hyperparameters in Table S2.</w:t>
       </w:r>
     </w:p>
     <w:p>
@@ -23037,7 +23037,7 @@
         <w:t xml:space="preserve"> </w:t>
       </w:r>
       <w:r>
-        <w:t xml:space="preserve">feeds the FiLM input in Figure 16 (Denoiser training); details and probabilities in Section 4.6 and Table B.1b.</w:t>
+        <w:t xml:space="preserve">feeds the FiLM input in Figure 16 (Denoiser training); details and probabilities in Section 4.6 and Table S3.</w:t>
       </w:r>
     </w:p>
     <w:p>
@@ -23592,7 +23592,7 @@
         <w:t xml:space="preserve"> </w:t>
       </w:r>
       <w:r>
-        <w:t xml:space="preserve">of Section 4.6 (full hyperparameters in Table B.1b).</w:t>
+        <w:t xml:space="preserve">of Section 4.6 (full hyperparameters in Table S3).</w:t>
       </w:r>
     </w:p>
     <w:p>
@@ -24385,7 +24385,7 @@
         </m:r>
       </m:oMath>
       <w:r>
-        <w:t xml:space="preserve">; AdamW + EMA. Hyperparameters in Table B.1b.</w:t>
+        <w:t xml:space="preserve">; AdamW + EMA. Hyperparameters in Table S3.</w:t>
       </w:r>
     </w:p>
     <w:p>
@@ -24878,7 +24878,7 @@
         <w:t xml:space="preserve">weighted_mask=true</w:t>
       </w:r>
       <w:r>
-        <w:t xml:space="preserve">, property-dropout 0.30). Both are 44.6 M-parameter FiLM-ResNets with Section 4.7 architecture; only the training-data tilt differs. Hyperparameters of both checkpoints are listed in Table B.1b.</w:t>
+        <w:t xml:space="preserve">, property-dropout 0.30). Both are 44.6 M-parameter FiLM-ResNets with Section 4.7 architecture; only the training-data tilt differs. Hyperparameters of both checkpoints are listed in Table S3.</w:t>
       </w:r>
     </w:p>
     <w:p>
@@ -25494,7 +25494,7 @@
         <w:t xml:space="preserve"> </w:t>
       </w:r>
       <w:r>
-        <w:t xml:space="preserve">is held for Figure 19 (Self-distillation). Sources in Table B.1c.</w:t>
+        <w:t xml:space="preserve">is held for Figure 19 (Self-distillation). Sources in Table S4.</w:t>
       </w:r>
     </w:p>
     <w:p>
@@ -26194,7 +26194,7 @@
         <w:t xml:space="preserve"> </w:t>
       </w:r>
       <w:r>
-        <w:t xml:space="preserve">at convergence (values in Table B.1b). Optimiser AdamW, peak LR</w:t>
+        <w:t xml:space="preserve">at convergence (values in Table S3). Optimiser AdamW, peak LR</w:t>
       </w:r>
       <w:r>
         <w:t xml:space="preserve"> </w:t>

</xml_diff>

<commit_message>
Add SureChEMBL patent-corpus novelty check (all 11 L-set leads absent)
UniChem/SureChEMBL lookup (InChIKey-based) confirms all 10 L-set leads are absent
from SureChEMBL patent structures (and from every UniChem source); E1 is present in
SureChEMBL (corroborating it is a known, patented structure). Added SureChEMBL to
the novelty statements (L1 mention with citation, scope caveat, conclusion) and a
SureChEMBL reference (Papadatos et al. 2016). The scope caveat now states all eleven
leads are absent from PubChem + SureChEMBL + the labelled master, with a full CAS
Registry check still recommended.

Main reference list now 71 (all cited, sequential). Rebuilt molecules HTML/docx.

Co-Authored-By: Claude Opus 4.8 <noreply@anthropic.com>
</commit_message>
<xml_diff>
--- a/paper/molecules/molecules_paper.docx
+++ b/paper/molecules/molecules_paper.docx
@@ -1125,7 +1125,21 @@
         </m:r>
       </m:oMath>
       <w:r>
-        <w:t xml:space="preserve">B97X-D3BJ/def2-TZVP. Lead L1 (trinitro-1,2-isoxazole) is absent from PubChem and the 65 980-row labelled master (max-Tanimoto 0.27); DFT-calibrated:</w:t>
+        <w:t xml:space="preserve">B97X-D3BJ/def2-TZVP. Lead L1 (trinitro-1,2-isoxazole) is absent from PubChem, the SureChEMBL patent corpus</w:t>
+      </w:r>
+      <w:r>
+        <w:t xml:space="preserve"> </w:t>
+      </w:r>
+      <w:hyperlink w:anchor="ref-surechembl">
+        <w:r>
+          <w:rPr>
+            <w:rStyle w:val="Hyperlink"/>
+          </w:rPr>
+          <w:t xml:space="preserve">[5]</w:t>
+        </w:r>
+      </w:hyperlink>
+      <w:r>
+        <w:t xml:space="preserve">, and the 65 980-row labelled master (max-Tanimoto 0.27); DFT-calibrated:</w:t>
       </w:r>
       <w:r>
         <w:t xml:space="preserve"> </w:t>
@@ -1446,23 +1460,6 @@
           <w:rPr>
             <w:rStyle w:val="Hyperlink"/>
           </w:rPr>
-          <w:t xml:space="preserve">[5]</w:t>
-        </w:r>
-      </w:hyperlink>
-      <w:r>
-        <w:t xml:space="preserve"> </w:t>
-      </w:r>
-      <w:r>
-        <w:t xml:space="preserve">introduced the encoder/decoder recipe over SMILES; the Junction-Tree VAE of Jin, Barzilay and Jaakkola</w:t>
-      </w:r>
-      <w:r>
-        <w:t xml:space="preserve"> </w:t>
-      </w:r>
-      <w:hyperlink w:anchor="ref-jin2018junction">
-        <w:r>
-          <w:rPr>
-            <w:rStyle w:val="Hyperlink"/>
-          </w:rPr>
           <w:t xml:space="preserve">[6]</w:t>
         </w:r>
       </w:hyperlink>
@@ -1470,12 +1467,12 @@
         <w:t xml:space="preserve"> </w:t>
       </w:r>
       <w:r>
-        <w:t xml:space="preserve">moved the latent up to fragment graphs to guarantee chemical validity; CDDD</w:t>
-      </w:r>
-      <w:r>
-        <w:t xml:space="preserve"> </w:t>
-      </w:r>
-      <w:hyperlink w:anchor="ref-winter2019cddd">
+        <w:t xml:space="preserve">introduced the encoder/decoder recipe over SMILES; the Junction-Tree VAE of Jin, Barzilay and Jaakkola</w:t>
+      </w:r>
+      <w:r>
+        <w:t xml:space="preserve"> </w:t>
+      </w:r>
+      <w:hyperlink w:anchor="ref-jin2018junction">
         <w:r>
           <w:rPr>
             <w:rStyle w:val="Hyperlink"/>
@@ -1487,12 +1484,12 @@
         <w:t xml:space="preserve"> </w:t>
       </w:r>
       <w:r>
-        <w:t xml:space="preserve">learned the latent by translating between equivalent string representations and showed that the resulting descriptors transfer to property prediction; Mol-CycleGAN</w:t>
-      </w:r>
-      <w:r>
-        <w:t xml:space="preserve"> </w:t>
-      </w:r>
-      <w:hyperlink w:anchor="ref-maziarka2020molcyclegan">
+        <w:t xml:space="preserve">moved the latent up to fragment graphs to guarantee chemical validity; CDDD</w:t>
+      </w:r>
+      <w:r>
+        <w:t xml:space="preserve"> </w:t>
+      </w:r>
+      <w:hyperlink w:anchor="ref-winter2019cddd">
         <w:r>
           <w:rPr>
             <w:rStyle w:val="Hyperlink"/>
@@ -1504,12 +1501,12 @@
         <w:t xml:space="preserve"> </w:t>
       </w:r>
       <w:r>
-        <w:t xml:space="preserve">reframed property optimisation as image-to-image translation between molecule sets. SELFIES</w:t>
-      </w:r>
-      <w:r>
-        <w:t xml:space="preserve"> </w:t>
-      </w:r>
-      <w:hyperlink w:anchor="ref-krenn2020selfies">
+        <w:t xml:space="preserve">learned the latent by translating between equivalent string representations and showed that the resulting descriptors transfer to property prediction; Mol-CycleGAN</w:t>
+      </w:r>
+      <w:r>
+        <w:t xml:space="preserve"> </w:t>
+      </w:r>
+      <w:hyperlink w:anchor="ref-maziarka2020molcyclegan">
         <w:r>
           <w:rPr>
             <w:rStyle w:val="Hyperlink"/>
@@ -1521,21 +1518,12 @@
         <w:t xml:space="preserve"> </w:t>
       </w:r>
       <w:r>
-        <w:t xml:space="preserve">replaced SMILES with a syntactically robust string representation in which every token sequence decodes to a valid graph, and is the representation we adopt at the encoder boundary.</w:t>
-      </w:r>
-    </w:p>
-    <w:p>
-      <w:pPr>
-        <w:pStyle w:val="MDPI31text"/>
-        <w:ind w:left="2608"/>
-      </w:pPr>
-      <w:r>
-        <w:t xml:space="preserve">Two more recent latent generators are particularly relevant to DGLD. LIMO</w:t>
-      </w:r>
-      <w:r>
-        <w:t xml:space="preserve"> </w:t>
-      </w:r>
-      <w:hyperlink w:anchor="ref-eckmann2022limo">
+        <w:t xml:space="preserve">reframed property optimisation as image-to-image translation between molecule sets. SELFIES</w:t>
+      </w:r>
+      <w:r>
+        <w:t xml:space="preserve"> </w:t>
+      </w:r>
+      <w:hyperlink w:anchor="ref-krenn2020selfies">
         <w:r>
           <w:rPr>
             <w:rStyle w:val="Hyperlink"/>
@@ -1547,12 +1535,21 @@
         <w:t xml:space="preserve"> </w:t>
       </w:r>
       <w:r>
-        <w:t xml:space="preserve">couples an MLP-VAE over SELFIES with a non-autoregressive decoder, factoring decoding through a per-position categorical so that gradient-based latent optimisation does not have to differentiate through autoregressive sampling; LIMO is the encoder we fine-tune. MolMIM</w:t>
-      </w:r>
-      <w:r>
-        <w:t xml:space="preserve"> </w:t>
-      </w:r>
-      <w:hyperlink w:anchor="ref-reidenbach2023molmim">
+        <w:t xml:space="preserve">replaced SMILES with a syntactically robust string representation in which every token sequence decodes to a valid graph, and is the representation we adopt at the encoder boundary.</w:t>
+      </w:r>
+    </w:p>
+    <w:p>
+      <w:pPr>
+        <w:pStyle w:val="MDPI31text"/>
+        <w:ind w:left="2608"/>
+      </w:pPr>
+      <w:r>
+        <w:t xml:space="preserve">Two more recent latent generators are particularly relevant to DGLD. LIMO</w:t>
+      </w:r>
+      <w:r>
+        <w:t xml:space="preserve"> </w:t>
+      </w:r>
+      <w:hyperlink w:anchor="ref-eckmann2022limo">
         <w:r>
           <w:rPr>
             <w:rStyle w:val="Hyperlink"/>
@@ -1564,12 +1561,12 @@
         <w:t xml:space="preserve"> </w:t>
       </w:r>
       <w:r>
-        <w:t xml:space="preserve">trains a Perceiver-encoder</w:t>
-      </w:r>
-      <w:r>
-        <w:t xml:space="preserve"> </w:t>
-      </w:r>
-      <w:hyperlink w:anchor="ref-jaegle2021perceiver">
+        <w:t xml:space="preserve">couples an MLP-VAE over SELFIES with a non-autoregressive decoder, factoring decoding through a per-position categorical so that gradient-based latent optimisation does not have to differentiate through autoregressive sampling; LIMO is the encoder we fine-tune. MolMIM</w:t>
+      </w:r>
+      <w:r>
+        <w:t xml:space="preserve"> </w:t>
+      </w:r>
+      <w:hyperlink w:anchor="ref-reidenbach2023molmim">
         <w:r>
           <w:rPr>
             <w:rStyle w:val="Hyperlink"/>
@@ -1581,21 +1578,12 @@
         <w:t xml:space="preserve"> </w:t>
       </w:r>
       <w:r>
-        <w:t xml:space="preserve">mutual-information VAE on billion-scale SMILES and provides a strong no-diffusion baseline against which our latent-diffusion prior is compared.</w:t>
-      </w:r>
-    </w:p>
-    <w:p>
-      <w:pPr>
-        <w:pStyle w:val="MDPI31text"/>
-        <w:ind w:left="2608"/>
-      </w:pPr>
-      <w:r>
-        <w:t xml:space="preserve">Language-modelling approaches treat SMILES directly as a string. REINVENT</w:t>
-      </w:r>
-      <w:r>
-        <w:t xml:space="preserve"> </w:t>
-      </w:r>
-      <w:hyperlink w:anchor="ref-olivecrona2017reinvent">
+        <w:t xml:space="preserve">trains a Perceiver-encoder</w:t>
+      </w:r>
+      <w:r>
+        <w:t xml:space="preserve"> </w:t>
+      </w:r>
+      <w:hyperlink w:anchor="ref-jaegle2021perceiver">
         <w:r>
           <w:rPr>
             <w:rStyle w:val="Hyperlink"/>
@@ -1607,12 +1595,21 @@
         <w:t xml:space="preserve"> </w:t>
       </w:r>
       <w:r>
-        <w:t xml:space="preserve">trained a recurrent generator on SMILES and biased it toward design objectives via reinforcement learning; Loeffler et al.</w:t>
-      </w:r>
-      <w:r>
-        <w:t xml:space="preserve"> </w:t>
-      </w:r>
-      <w:hyperlink w:anchor="ref-loeffler2024reinvent4">
+        <w:t xml:space="preserve">mutual-information VAE on billion-scale SMILES and provides a strong no-diffusion baseline against which our latent-diffusion prior is compared.</w:t>
+      </w:r>
+    </w:p>
+    <w:p>
+      <w:pPr>
+        <w:pStyle w:val="MDPI31text"/>
+        <w:ind w:left="2608"/>
+      </w:pPr>
+      <w:r>
+        <w:t xml:space="preserve">Language-modelling approaches treat SMILES directly as a string. REINVENT</w:t>
+      </w:r>
+      <w:r>
+        <w:t xml:space="preserve"> </w:t>
+      </w:r>
+      <w:hyperlink w:anchor="ref-olivecrona2017reinvent">
         <w:r>
           <w:rPr>
             <w:rStyle w:val="Hyperlink"/>
@@ -1624,12 +1621,12 @@
         <w:t xml:space="preserve"> </w:t>
       </w:r>
       <w:r>
-        <w:t xml:space="preserve">describe REINVENT 4, the modern evolution that integrates multiple generator architectures (de novo RNN, scaffold decoration, fragment linking, Mol2Mol transformer) within a unified staged RL/CL framework with a plugin scoring subsystem, and is used here as an RL-based comparative baseline. REINVENT 4 biases generation via a policy-gradient reward signal over a pretrained prior; DGLD instead learns a conditional prior through latent diffusion, separating prior learning (training) from property steering (guidance), and requires no RL reward engineering at generation time. Several REINVENT 4 mechanisms are inspirationally relevant: the diversity filter (Murcko scaffold bucketing) is analogous to our Tanimoto novelty window; staged learning mirrors our guidance-weight annealing schedule. ChemTS</w:t>
-      </w:r>
-      <w:r>
-        <w:t xml:space="preserve"> </w:t>
-      </w:r>
-      <w:hyperlink w:anchor="ref-yang2017chemts">
+        <w:t xml:space="preserve">trained a recurrent generator on SMILES and biased it toward design objectives via reinforcement learning; Loeffler et al.</w:t>
+      </w:r>
+      <w:r>
+        <w:t xml:space="preserve"> </w:t>
+      </w:r>
+      <w:hyperlink w:anchor="ref-loeffler2024reinvent4">
         <w:r>
           <w:rPr>
             <w:rStyle w:val="Hyperlink"/>
@@ -1641,12 +1638,12 @@
         <w:t xml:space="preserve"> </w:t>
       </w:r>
       <w:r>
-        <w:t xml:space="preserve">combined an RNN prior with Monte-Carlo tree search; MolGPT</w:t>
-      </w:r>
-      <w:r>
-        <w:t xml:space="preserve"> </w:t>
-      </w:r>
-      <w:hyperlink w:anchor="ref-bagal2022molgpt">
+        <w:t xml:space="preserve">describe REINVENT 4, the modern evolution that integrates multiple generator architectures (de novo RNN, scaffold decoration, fragment linking, Mol2Mol transformer) within a unified staged RL/CL framework with a plugin scoring subsystem, and is used here as an RL-based comparative baseline. REINVENT 4 biases generation via a policy-gradient reward signal over a pretrained prior; DGLD instead learns a conditional prior through latent diffusion, separating prior learning (training) from property steering (guidance), and requires no RL reward engineering at generation time. Several REINVENT 4 mechanisms are inspirationally relevant: the diversity filter (Murcko scaffold bucketing) is analogous to our Tanimoto novelty window; staged learning mirrors our guidance-weight annealing schedule. ChemTS</w:t>
+      </w:r>
+      <w:r>
+        <w:t xml:space="preserve"> </w:t>
+      </w:r>
+      <w:hyperlink w:anchor="ref-yang2017chemts">
         <w:r>
           <w:rPr>
             <w:rStyle w:val="Hyperlink"/>
@@ -1658,12 +1655,12 @@
         <w:t xml:space="preserve"> </w:t>
       </w:r>
       <w:r>
-        <w:t xml:space="preserve">applied a GPT-style decoder with property tokens prepended for control. MoLFormer-XL</w:t>
-      </w:r>
-      <w:r>
-        <w:t xml:space="preserve"> </w:t>
-      </w:r>
-      <w:hyperlink w:anchor="ref-ross2022molformer">
+        <w:t xml:space="preserve">combined an RNN prior with Monte-Carlo tree search; MolGPT</w:t>
+      </w:r>
+      <w:r>
+        <w:t xml:space="preserve"> </w:t>
+      </w:r>
+      <w:hyperlink w:anchor="ref-bagal2022molgpt">
         <w:r>
           <w:rPr>
             <w:rStyle w:val="Hyperlink"/>
@@ -1675,12 +1672,12 @@
         <w:t xml:space="preserve"> </w:t>
       </w:r>
       <w:r>
-        <w:t xml:space="preserve">and Chemformer</w:t>
-      </w:r>
-      <w:r>
-        <w:t xml:space="preserve"> </w:t>
-      </w:r>
-      <w:hyperlink w:anchor="ref-irwin2022chemformer">
+        <w:t xml:space="preserve">applied a GPT-style decoder with property tokens prepended for control. MoLFormer-XL</w:t>
+      </w:r>
+      <w:r>
+        <w:t xml:space="preserve"> </w:t>
+      </w:r>
+      <w:hyperlink w:anchor="ref-ross2022molformer">
         <w:r>
           <w:rPr>
             <w:rStyle w:val="Hyperlink"/>
@@ -1692,12 +1689,12 @@
         <w:t xml:space="preserve"> </w:t>
       </w:r>
       <w:r>
-        <w:t xml:space="preserve">showed that BERT/T5-style pretraining on hundreds of millions of SMILES yields representations that transfer cleanly to property-prediction tasks. The flow-network approach of Bengio et al.</w:t>
-      </w:r>
-      <w:r>
-        <w:t xml:space="preserve"> </w:t>
-      </w:r>
-      <w:hyperlink w:anchor="ref-bengio2021gflownet">
+        <w:t xml:space="preserve">and Chemformer</w:t>
+      </w:r>
+      <w:r>
+        <w:t xml:space="preserve"> </w:t>
+      </w:r>
+      <w:hyperlink w:anchor="ref-irwin2022chemformer">
         <w:r>
           <w:rPr>
             <w:rStyle w:val="Hyperlink"/>
@@ -1709,12 +1706,12 @@
         <w:t xml:space="preserve"> </w:t>
       </w:r>
       <w:r>
-        <w:t xml:space="preserve">reformulates non-iterative diverse candidate generation as flow matching over an implicit reward landscape and is conceptually closer to our guided sampling than to autoregressive language modelling. On the graph side, DiGress</w:t>
-      </w:r>
-      <w:r>
-        <w:t xml:space="preserve"> </w:t>
-      </w:r>
-      <w:hyperlink w:anchor="ref-vignac2023digress">
+        <w:t xml:space="preserve">showed that BERT/T5-style pretraining on hundreds of millions of SMILES yields representations that transfer cleanly to property-prediction tasks. The flow-network approach of Bengio et al.</w:t>
+      </w:r>
+      <w:r>
+        <w:t xml:space="preserve"> </w:t>
+      </w:r>
+      <w:hyperlink w:anchor="ref-bengio2021gflownet">
         <w:r>
           <w:rPr>
             <w:rStyle w:val="Hyperlink"/>
@@ -1726,30 +1723,12 @@
         <w:t xml:space="preserve"> </w:t>
       </w:r>
       <w:r>
-        <w:t xml:space="preserve">performs discrete denoising diffusion directly on molecular graphs, achieving exact validity at the cost of having to re-introduce property conditioning via a separate guidance term.</w:t>
-      </w:r>
-    </w:p>
-    <w:p>
-      <w:pPr>
-        <w:pStyle w:val="MDPI22heading2"/>
-        <w:ind w:left="2608"/>
-      </w:pPr>
-      <w:r>
-        <w:t xml:space="preserve">1.1.2 Diffusion models and classifier guidance</w:t>
-      </w:r>
-    </w:p>
-    <w:p>
-      <w:pPr>
-        <w:pStyle w:val="MDPI32textnoindent"/>
-        <w:ind w:left="2608"/>
-      </w:pPr>
-      <w:r>
-        <w:t xml:space="preserve">Denoising diffusion probabilistic models</w:t>
-      </w:r>
-      <w:r>
-        <w:t xml:space="preserve"> </w:t>
-      </w:r>
-      <w:hyperlink w:anchor="ref-ho2020ddpm">
+        <w:t xml:space="preserve">reformulates non-iterative diverse candidate generation as flow matching over an implicit reward landscape and is conceptually closer to our guided sampling than to autoregressive language modelling. On the graph side, DiGress</w:t>
+      </w:r>
+      <w:r>
+        <w:t xml:space="preserve"> </w:t>
+      </w:r>
+      <w:hyperlink w:anchor="ref-vignac2023digress">
         <w:r>
           <w:rPr>
             <w:rStyle w:val="Hyperlink"/>
@@ -1761,12 +1740,30 @@
         <w:t xml:space="preserve"> </w:t>
       </w:r>
       <w:r>
-        <w:t xml:space="preserve">and the score-based formulation of Song and Ermon</w:t>
-      </w:r>
-      <w:r>
-        <w:t xml:space="preserve"> </w:t>
-      </w:r>
-      <w:hyperlink w:anchor="ref-song2019score">
+        <w:t xml:space="preserve">performs discrete denoising diffusion directly on molecular graphs, achieving exact validity at the cost of having to re-introduce property conditioning via a separate guidance term.</w:t>
+      </w:r>
+    </w:p>
+    <w:p>
+      <w:pPr>
+        <w:pStyle w:val="MDPI22heading2"/>
+        <w:ind w:left="2608"/>
+      </w:pPr>
+      <w:r>
+        <w:t xml:space="preserve">1.1.2 Diffusion models and classifier guidance</w:t>
+      </w:r>
+    </w:p>
+    <w:p>
+      <w:pPr>
+        <w:pStyle w:val="MDPI32textnoindent"/>
+        <w:ind w:left="2608"/>
+      </w:pPr>
+      <w:r>
+        <w:t xml:space="preserve">Denoising diffusion probabilistic models</w:t>
+      </w:r>
+      <w:r>
+        <w:t xml:space="preserve"> </w:t>
+      </w:r>
+      <w:hyperlink w:anchor="ref-ho2020ddpm">
         <w:r>
           <w:rPr>
             <w:rStyle w:val="Hyperlink"/>
@@ -1775,12 +1772,15 @@
         </w:r>
       </w:hyperlink>
       <w:r>
-        <w:t xml:space="preserve">, later unified through a stochastic-differential-equation perspective</w:t>
-      </w:r>
-      <w:r>
-        <w:t xml:space="preserve"> </w:t>
-      </w:r>
-      <w:hyperlink w:anchor="ref-song2021sde">
+        <w:t xml:space="preserve"> </w:t>
+      </w:r>
+      <w:r>
+        <w:t xml:space="preserve">and the score-based formulation of Song and Ermon</w:t>
+      </w:r>
+      <w:r>
+        <w:t xml:space="preserve"> </w:t>
+      </w:r>
+      <w:hyperlink w:anchor="ref-song2019score">
         <w:r>
           <w:rPr>
             <w:rStyle w:val="Hyperlink"/>
@@ -1789,6 +1789,20 @@
         </w:r>
       </w:hyperlink>
       <w:r>
+        <w:t xml:space="preserve">, later unified through a stochastic-differential-equation perspective</w:t>
+      </w:r>
+      <w:r>
+        <w:t xml:space="preserve"> </w:t>
+      </w:r>
+      <w:hyperlink w:anchor="ref-song2021sde">
+        <w:r>
+          <w:rPr>
+            <w:rStyle w:val="Hyperlink"/>
+          </w:rPr>
+          <w:t xml:space="preserve">[24]</w:t>
+        </w:r>
+      </w:hyperlink>
+      <w:r>
         <w:t xml:space="preserve">, define the generative-modelling family that DGLD builds on. Latent diffusion</w:t>
       </w:r>
       <w:r>
@@ -1799,7 +1813,7 @@
           <w:rPr>
             <w:rStyle w:val="Hyperlink"/>
           </w:rPr>
-          <w:t xml:space="preserve">[24]</w:t>
+          <w:t xml:space="preserve">[25]</w:t>
         </w:r>
       </w:hyperlink>
       <w:r>
@@ -2109,48 +2123,16 @@
           <w:rPr>
             <w:rStyle w:val="Hyperlink"/>
           </w:rPr>
-          <w:t xml:space="preserve">[25]</w:t>
-        </w:r>
-      </w:hyperlink>
-      <w:r>
-        <w:t xml:space="preserve">. DGLD combines both regimes: classifier-free guidance over the four detonation targets, plus a small noise-conditional multi-task score model whose per-head gradients are added at every diffusion step (Section 4.10). Conditioning is injected into the residual blocks of the denoiser through FiLM-style affine feature-wise modulation</w:t>
-      </w:r>
-      <w:r>
-        <w:t xml:space="preserve"> </w:t>
-      </w:r>
-      <w:hyperlink w:anchor="ref-perez2018film">
-        <w:r>
-          <w:rPr>
-            <w:rStyle w:val="Hyperlink"/>
-          </w:rPr>
           <w:t xml:space="preserve">[26]</w:t>
         </w:r>
       </w:hyperlink>
       <w:r>
-        <w:t xml:space="preserve">, the standard mechanism for property conditioning in image and molecular diffusion alike.</w:t>
-      </w:r>
-    </w:p>
-    <w:p>
-      <w:pPr>
-        <w:pStyle w:val="MDPI22heading2"/>
-        <w:ind w:left="2608"/>
-      </w:pPr>
-      <w:r>
-        <w:t xml:space="preserve">1.1.3 3D and target-conditioned molecular diffusion</w:t>
-      </w:r>
-    </w:p>
-    <w:p>
-      <w:pPr>
-        <w:pStyle w:val="MDPI32textnoindent"/>
-        <w:ind w:left="2608"/>
-      </w:pPr>
-      <w:r>
-        <w:t xml:space="preserve">A parallel line of work runs diffusion directly on 3D molecular geometries rather than on a learned latent. Equivariant Diffusion (EDM)</w:t>
-      </w:r>
-      <w:r>
-        <w:t xml:space="preserve"> </w:t>
-      </w:r>
-      <w:hyperlink w:anchor="ref-hoogeboom2022edm">
+        <w:t xml:space="preserve">. DGLD combines both regimes: classifier-free guidance over the four detonation targets, plus a small noise-conditional multi-task score model whose per-head gradients are added at every diffusion step (Section 4.10). Conditioning is injected into the residual blocks of the denoiser through FiLM-style affine feature-wise modulation</w:t>
+      </w:r>
+      <w:r>
+        <w:t xml:space="preserve"> </w:t>
+      </w:r>
+      <w:hyperlink w:anchor="ref-perez2018film">
         <w:r>
           <w:rPr>
             <w:rStyle w:val="Hyperlink"/>
@@ -2159,15 +2141,30 @@
         </w:r>
       </w:hyperlink>
       <w:r>
-        <w:t xml:space="preserve"> </w:t>
-      </w:r>
-      <w:r>
-        <w:t xml:space="preserve">diffuses atom positions and types under SE(3)-equivariant networks, providing the architectural template for subsequent target-aware variants. DiffSBDD</w:t>
-      </w:r>
-      <w:r>
-        <w:t xml:space="preserve"> </w:t>
-      </w:r>
-      <w:hyperlink w:anchor="ref-schneuing2022diffsbdd">
+        <w:t xml:space="preserve">, the standard mechanism for property conditioning in image and molecular diffusion alike.</w:t>
+      </w:r>
+    </w:p>
+    <w:p>
+      <w:pPr>
+        <w:pStyle w:val="MDPI22heading2"/>
+        <w:ind w:left="2608"/>
+      </w:pPr>
+      <w:r>
+        <w:t xml:space="preserve">1.1.3 3D and target-conditioned molecular diffusion</w:t>
+      </w:r>
+    </w:p>
+    <w:p>
+      <w:pPr>
+        <w:pStyle w:val="MDPI32textnoindent"/>
+        <w:ind w:left="2608"/>
+      </w:pPr>
+      <w:r>
+        <w:t xml:space="preserve">A parallel line of work runs diffusion directly on 3D molecular geometries rather than on a learned latent. Equivariant Diffusion (EDM)</w:t>
+      </w:r>
+      <w:r>
+        <w:t xml:space="preserve"> </w:t>
+      </w:r>
+      <w:hyperlink w:anchor="ref-hoogeboom2022edm">
         <w:r>
           <w:rPr>
             <w:rStyle w:val="Hyperlink"/>
@@ -2179,12 +2176,12 @@
         <w:t xml:space="preserve"> </w:t>
       </w:r>
       <w:r>
-        <w:t xml:space="preserve">and TargetDiff</w:t>
-      </w:r>
-      <w:r>
-        <w:t xml:space="preserve"> </w:t>
-      </w:r>
-      <w:hyperlink w:anchor="ref-guan2023targetdiff">
+        <w:t xml:space="preserve">diffuses atom positions and types under SE(3)-equivariant networks, providing the architectural template for subsequent target-aware variants. DiffSBDD</w:t>
+      </w:r>
+      <w:r>
+        <w:t xml:space="preserve"> </w:t>
+      </w:r>
+      <w:hyperlink w:anchor="ref-schneuing2022diffsbdd">
         <w:r>
           <w:rPr>
             <w:rStyle w:val="Hyperlink"/>
@@ -2196,12 +2193,12 @@
         <w:t xml:space="preserve"> </w:t>
       </w:r>
       <w:r>
-        <w:t xml:space="preserve">condition the diffusion process on a 3D protein pocket; Pocket2Mol</w:t>
-      </w:r>
-      <w:r>
-        <w:t xml:space="preserve"> </w:t>
-      </w:r>
-      <w:hyperlink w:anchor="ref-peng2022pocket2mol">
+        <w:t xml:space="preserve">and TargetDiff</w:t>
+      </w:r>
+      <w:r>
+        <w:t xml:space="preserve"> </w:t>
+      </w:r>
+      <w:hyperlink w:anchor="ref-guan2023targetdiff">
         <w:r>
           <w:rPr>
             <w:rStyle w:val="Hyperlink"/>
@@ -2213,12 +2210,12 @@
         <w:t xml:space="preserve"> </w:t>
       </w:r>
       <w:r>
-        <w:t xml:space="preserve">samples atoms autoregressively inside the pocket; DiffDock</w:t>
-      </w:r>
-      <w:r>
-        <w:t xml:space="preserve"> </w:t>
-      </w:r>
-      <w:hyperlink w:anchor="ref-corso2023diffdock">
+        <w:t xml:space="preserve">condition the diffusion process on a 3D protein pocket; Pocket2Mol</w:t>
+      </w:r>
+      <w:r>
+        <w:t xml:space="preserve"> </w:t>
+      </w:r>
+      <w:hyperlink w:anchor="ref-peng2022pocket2mol">
         <w:r>
           <w:rPr>
             <w:rStyle w:val="Hyperlink"/>
@@ -2230,12 +2227,12 @@
         <w:t xml:space="preserve"> </w:t>
       </w:r>
       <w:r>
-        <w:t xml:space="preserve">recasts molecular docking itself as a generative diffusion problem over translation, rotation, and torsion. MolDiff</w:t>
-      </w:r>
-      <w:r>
-        <w:t xml:space="preserve"> </w:t>
-      </w:r>
-      <w:hyperlink w:anchor="ref-peng2023moldiff">
+        <w:t xml:space="preserve">samples atoms autoregressively inside the pocket; DiffDock</w:t>
+      </w:r>
+      <w:r>
+        <w:t xml:space="preserve"> </w:t>
+      </w:r>
+      <w:hyperlink w:anchor="ref-corso2023diffdock">
         <w:r>
           <w:rPr>
             <w:rStyle w:val="Hyperlink"/>
@@ -2247,6 +2244,23 @@
         <w:t xml:space="preserve"> </w:t>
       </w:r>
       <w:r>
+        <w:t xml:space="preserve">recasts molecular docking itself as a generative diffusion problem over translation, rotation, and torsion. MolDiff</w:t>
+      </w:r>
+      <w:r>
+        <w:t xml:space="preserve"> </w:t>
+      </w:r>
+      <w:hyperlink w:anchor="ref-peng2023moldiff">
+        <w:r>
+          <w:rPr>
+            <w:rStyle w:val="Hyperlink"/>
+          </w:rPr>
+          <w:t xml:space="preserve">[33]</w:t>
+        </w:r>
+      </w:hyperlink>
+      <w:r>
+        <w:t xml:space="preserve"> </w:t>
+      </w:r>
+      <w:r>
         <w:t xml:space="preserve">addresses the atom-bond inconsistency that arises when atom positions and bond types are diffused independently.</w:t>
       </w:r>
     </w:p>
@@ -2266,7 +2280,7 @@
           <w:rPr>
             <w:rStyle w:val="Hyperlink"/>
           </w:rPr>
-          <w:t xml:space="preserve">[33]</w:t>
+          <w:t xml:space="preserve">[34]</w:t>
         </w:r>
       </w:hyperlink>
       <w:r>
@@ -2372,7 +2386,7 @@
           <w:rPr>
             <w:rStyle w:val="Hyperlink"/>
           </w:rPr>
-          <w:t xml:space="preserve">[34]</w:t>
+          <w:t xml:space="preserve">[35]</w:t>
         </w:r>
       </w:hyperlink>
       <w:r>
@@ -2428,7 +2442,7 @@
           <w:rPr>
             <w:rStyle w:val="Hyperlink"/>
           </w:rPr>
-          <w:t xml:space="preserve">[35]</w:t>
+          <w:t xml:space="preserve">[36]</w:t>
         </w:r>
       </w:hyperlink>
       <w:r>
@@ -2468,7 +2482,7 @@
           <w:rPr>
             <w:rStyle w:val="Hyperlink"/>
           </w:rPr>
-          <w:t xml:space="preserve">[36]</w:t>
+          <w:t xml:space="preserve">[37]</w:t>
         </w:r>
       </w:hyperlink>
       <w:r>
@@ -2481,6 +2495,111 @@
         <w:t xml:space="preserve"> </w:t>
       </w:r>
       <w:hyperlink w:anchor="ref-suceska2018explo5">
+        <w:r>
+          <w:rPr>
+            <w:rStyle w:val="Hyperlink"/>
+          </w:rPr>
+          <w:t xml:space="preserve">[38]</w:t>
+        </w:r>
+      </w:hyperlink>
+      <w:r>
+        <w:t xml:space="preserve"> </w:t>
+      </w:r>
+      <w:r>
+        <w:t xml:space="preserve">and Cheetah</w:t>
+      </w:r>
+      <w:r>
+        <w:t xml:space="preserve"> </w:t>
+      </w:r>
+      <w:hyperlink w:anchor="ref-fried2014cheetah">
+        <w:r>
+          <w:rPr>
+            <w:rStyle w:val="Hyperlink"/>
+          </w:rPr>
+          <w:t xml:space="preserve">[39]</w:t>
+        </w:r>
+      </w:hyperlink>
+      <w:r>
+        <w:t xml:space="preserve"> </w:t>
+      </w:r>
+      <w:r>
+        <w:t xml:space="preserve">replace the closed-form K-J step with a thermochemical-equilibrium Chapman–Jouguet solver and a covolume equation of state (EOS), and remain the absolute-value-grade reference; we use K-J as the closed-form approximation and acknowledge the absolute-value gap explicitly (Section 2.3). The recent Choi et al. review</w:t>
+      </w:r>
+      <w:r>
+        <w:t xml:space="preserve"> </w:t>
+      </w:r>
+      <w:hyperlink w:anchor="ref-choi2023prep">
+        <w:r>
+          <w:rPr>
+            <w:rStyle w:val="Hyperlink"/>
+          </w:rPr>
+          <w:t xml:space="preserve">[40]</w:t>
+        </w:r>
+      </w:hyperlink>
+      <w:r>
+        <w:t xml:space="preserve"> </w:t>
+      </w:r>
+      <w:r>
+        <w:t xml:space="preserve">surveys the state of AI approaches for energetic materials by design and codifies the field's challenges and current best practices, and we adopt its taxonomy of property-prediction vs generation pipelines as the literature backdrop. Recent ML approaches to crystal density itself (</w:t>
+      </w:r>
+      <w:hyperlink w:anchor="ref-mlcrystdens-cm-2024">
+        <w:r>
+          <w:rPr>
+            <w:rStyle w:val="Hyperlink"/>
+          </w:rPr>
+          <w:t xml:space="preserve">[41]</w:t>
+        </w:r>
+      </w:hyperlink>
+      <w:r>
+        <w:t xml:space="preserve">) are complementary to our gas-phase Bondi-vdW</w:t>
+      </w:r>
+      <w:r>
+        <w:t xml:space="preserve"> </w:t>
+      </w:r>
+      <w:hyperlink w:anchor="ref-bondi1964vdw">
+        <w:r>
+          <w:rPr>
+            <w:rStyle w:val="Hyperlink"/>
+          </w:rPr>
+          <w:t xml:space="preserve">[42]</w:t>
+        </w:r>
+      </w:hyperlink>
+      <w:r>
+        <w:t xml:space="preserve"> </w:t>
+      </w:r>
+      <w:r>
+        <w:t xml:space="preserve">+ 6-anchor-calibration recipe and would substitute cleanly for it once retrained on a polynitro-enriched corpus.</w:t>
+      </w:r>
+    </w:p>
+    <w:p>
+      <w:pPr>
+        <w:pStyle w:val="MDPI31text"/>
+        <w:ind w:left="2608"/>
+      </w:pPr>
+      <w:r>
+        <w:t xml:space="preserve">Sensitivity prediction is the harder discriminative half of the field. Nefati, Cense and Legendre</w:t>
+      </w:r>
+      <w:r>
+        <w:t xml:space="preserve"> </w:t>
+      </w:r>
+      <w:hyperlink w:anchor="ref-nefati1996ann">
+        <w:r>
+          <w:rPr>
+            <w:rStyle w:val="Hyperlink"/>
+          </w:rPr>
+          <w:t xml:space="preserve">[43]</w:t>
+        </w:r>
+      </w:hyperlink>
+      <w:r>
+        <w:t xml:space="preserve"> </w:t>
+      </w:r>
+      <w:r>
+        <w:t xml:space="preserve">trained an early neural network on impact-sensitivity data; Mathieu</w:t>
+      </w:r>
+      <w:r>
+        <w:t xml:space="preserve"> </w:t>
+      </w:r>
+      <w:hyperlink w:anchor="ref-mathieu2017sensitivity">
         <w:r>
           <w:rPr>
             <w:rStyle w:val="Hyperlink"/>
@@ -2492,146 +2611,12 @@
         <w:t xml:space="preserve"> </w:t>
       </w:r>
       <w:r>
-        <w:t xml:space="preserve">and Cheetah</w:t>
-      </w:r>
-      <w:r>
-        <w:t xml:space="preserve"> </w:t>
-      </w:r>
-      <w:hyperlink w:anchor="ref-fried2014cheetah">
-        <w:r>
-          <w:rPr>
-            <w:rStyle w:val="Hyperlink"/>
-          </w:rPr>
-          <w:t xml:space="preserve">[38]</w:t>
-        </w:r>
-      </w:hyperlink>
-      <w:r>
-        <w:t xml:space="preserve"> </w:t>
-      </w:r>
-      <w:r>
-        <w:t xml:space="preserve">replace the closed-form K-J step with a thermochemical-equilibrium Chapman–Jouguet solver and a covolume equation of state (EOS), and remain the absolute-value-grade reference; we use K-J as the closed-form approximation and acknowledge the absolute-value gap explicitly (Section 2.3). The recent Choi et al. review</w:t>
-      </w:r>
-      <w:r>
-        <w:t xml:space="preserve"> </w:t>
-      </w:r>
-      <w:hyperlink w:anchor="ref-choi2023prep">
-        <w:r>
-          <w:rPr>
-            <w:rStyle w:val="Hyperlink"/>
-          </w:rPr>
-          <w:t xml:space="preserve">[39]</w:t>
-        </w:r>
-      </w:hyperlink>
-      <w:r>
-        <w:t xml:space="preserve"> </w:t>
-      </w:r>
-      <w:r>
-        <w:t xml:space="preserve">surveys the state of AI approaches for energetic materials by design and codifies the field's challenges and current best practices, and we adopt its taxonomy of property-prediction vs generation pipelines as the literature backdrop. Recent ML approaches to crystal density itself (</w:t>
-      </w:r>
-      <w:hyperlink w:anchor="ref-mlcrystdens-cm-2024">
-        <w:r>
-          <w:rPr>
-            <w:rStyle w:val="Hyperlink"/>
-          </w:rPr>
-          <w:t xml:space="preserve">[40]</w:t>
-        </w:r>
-      </w:hyperlink>
-      <w:r>
-        <w:t xml:space="preserve">) are complementary to our gas-phase Bondi-vdW</w:t>
-      </w:r>
-      <w:r>
-        <w:t xml:space="preserve"> </w:t>
-      </w:r>
-      <w:hyperlink w:anchor="ref-bondi1964vdw">
-        <w:r>
-          <w:rPr>
-            <w:rStyle w:val="Hyperlink"/>
-          </w:rPr>
-          <w:t xml:space="preserve">[41]</w:t>
-        </w:r>
-      </w:hyperlink>
-      <w:r>
-        <w:t xml:space="preserve"> </w:t>
-      </w:r>
-      <w:r>
-        <w:t xml:space="preserve">+ 6-anchor-calibration recipe and would substitute cleanly for it once retrained on a polynitro-enriched corpus.</w:t>
-      </w:r>
-    </w:p>
-    <w:p>
-      <w:pPr>
-        <w:pStyle w:val="MDPI31text"/>
-        <w:ind w:left="2608"/>
-      </w:pPr>
-      <w:r>
-        <w:t xml:space="preserve">Sensitivity prediction is the harder discriminative half of the field. Nefati, Cense and Legendre</w:t>
-      </w:r>
-      <w:r>
-        <w:t xml:space="preserve"> </w:t>
-      </w:r>
-      <w:hyperlink w:anchor="ref-nefati1996ann">
-        <w:r>
-          <w:rPr>
-            <w:rStyle w:val="Hyperlink"/>
-          </w:rPr>
-          <w:t xml:space="preserve">[42]</w:t>
-        </w:r>
-      </w:hyperlink>
-      <w:r>
-        <w:t xml:space="preserve"> </w:t>
-      </w:r>
-      <w:r>
-        <w:t xml:space="preserve">trained an early neural network on impact-sensitivity data; Mathieu</w:t>
-      </w:r>
-      <w:r>
-        <w:t xml:space="preserve"> </w:t>
-      </w:r>
-      <w:hyperlink w:anchor="ref-mathieu2017sensitivity">
-        <w:r>
-          <w:rPr>
-            <w:rStyle w:val="Hyperlink"/>
-          </w:rPr>
-          <w:t xml:space="preserve">[36]</w:t>
-        </w:r>
-      </w:hyperlink>
-      <w:r>
-        <w:t xml:space="preserve"> </w:t>
-      </w:r>
-      <w:r>
         <w:t xml:space="preserve">reviewed the theoretical relationships between molecular structure, detonation performance, and sensitivity; Huang and Massa</w:t>
       </w:r>
       <w:r>
         <w:t xml:space="preserve"> </w:t>
       </w:r>
       <w:hyperlink w:anchor="ref-huang2021applying">
-        <w:r>
-          <w:rPr>
-            <w:rStyle w:val="Hyperlink"/>
-          </w:rPr>
-          <w:t xml:space="preserve">[43]</w:t>
-        </w:r>
-      </w:hyperlink>
-      <w:r>
-        <w:t xml:space="preserve"> </w:t>
-      </w:r>
-      <w:r>
-        <w:t xml:space="preserve">applied modern ML to the performance/stability trade-off, showing that h</w:t>
-      </w:r>
-      <w:r>
-        <w:rPr>
-          <w:vertAlign w:val="subscript"/>
-        </w:rPr>
-        <w:t xml:space="preserve">50</w:t>
-      </w:r>
-      <w:r>
-        <w:t xml:space="preserve"> </w:t>
-      </w:r>
-      <w:r>
-        <w:t xml:space="preserve">(the drop-weight height at which 50% of samples detonate on impact, a standard sensitivity measure) is learnable from descriptors and provides the regression target our hazard head approximates. The synthesis-chemistry review of Klapötke</w:t>
-      </w:r>
-      <w:r>
-        <w:t xml:space="preserve"> </w:t>
-      </w:r>
-      <w:hyperlink w:anchor="ref-klapotke2017nitrogen">
         <w:r>
           <w:rPr>
             <w:rStyle w:val="Hyperlink"/>
@@ -2643,30 +2628,24 @@
         <w:t xml:space="preserve"> </w:t>
       </w:r>
       <w:r>
-        <w:t xml:space="preserve">codifies the qualitative fragment priors (nitrogen-rich heterocycles, nitramines, azides) on which our motif-augmented training set is built.</w:t>
-      </w:r>
-    </w:p>
-    <w:p>
-      <w:pPr>
-        <w:pStyle w:val="MDPI22heading2"/>
-        <w:ind w:left="2608"/>
-      </w:pPr>
-      <w:r>
-        <w:t xml:space="preserve">1.1.5 Energetic-materials generative ML and synthesisability</w:t>
-      </w:r>
-    </w:p>
-    <w:p>
-      <w:pPr>
-        <w:pStyle w:val="MDPI32textnoindent"/>
-        <w:ind w:left="2608"/>
-      </w:pPr>
-      <w:r>
-        <w:t xml:space="preserve">Generative work targeting the energetic-materials high-energy tail is comparatively recent and is constrained by the small size of the labelled corpus. The closest spiritual analogue to DGLD is the constrained Bayesian optimisation in a VAE latent of Griffiths and Hernández-Lobato</w:t>
-      </w:r>
-      <w:r>
-        <w:t xml:space="preserve"> </w:t>
-      </w:r>
-      <w:hyperlink w:anchor="ref-griffiths2020constrained">
+        <w:t xml:space="preserve">applied modern ML to the performance/stability trade-off, showing that h</w:t>
+      </w:r>
+      <w:r>
+        <w:rPr>
+          <w:vertAlign w:val="subscript"/>
+        </w:rPr>
+        <w:t xml:space="preserve">50</w:t>
+      </w:r>
+      <w:r>
+        <w:t xml:space="preserve"> </w:t>
+      </w:r>
+      <w:r>
+        <w:t xml:space="preserve">(the drop-weight height at which 50% of samples detonate on impact, a standard sensitivity measure) is learnable from descriptors and provides the regression target our hazard head approximates. The synthesis-chemistry review of Klapötke</w:t>
+      </w:r>
+      <w:r>
+        <w:t xml:space="preserve"> </w:t>
+      </w:r>
+      <w:hyperlink w:anchor="ref-klapotke2017nitrogen">
         <w:r>
           <w:rPr>
             <w:rStyle w:val="Hyperlink"/>
@@ -2675,26 +2654,33 @@
         </w:r>
       </w:hyperlink>
       <w:r>
-        <w:t xml:space="preserve">, which navigates a learned molecular prior under chemistry constraints; classifier-free latent diffusion subsumes this recipe in a single end-to-end model whose gradient comes from the score function rather than from a separately-trained acquisition oracle. The performance/stability balancing study of Huang et al.</w:t>
-      </w:r>
-      <w:r>
-        <w:t xml:space="preserve"> </w:t>
-      </w:r>
-      <w:hyperlink w:anchor="ref-huang2021applying">
-        <w:r>
-          <w:rPr>
-            <w:rStyle w:val="Hyperlink"/>
-          </w:rPr>
-          <w:t xml:space="preserve">[43]</w:t>
-        </w:r>
-      </w:hyperlink>
-      <w:r>
-        <w:t xml:space="preserve">, already cited above for sensitivity prediction, is the property-prediction-side counterpart of the multi-head trade-off DGLD enforces at generation time. The bulk of the prior ML work on energetic materials has been discriminative; the four-tier label hierarchy and tier-stratified conditioning-mask of Section 4 are designed precisely to make property-targeted generation viable in this small-and-noisy-label regime. The most direct contemporary competitor is the property-conditioned RNN of</w:t>
-      </w:r>
-      <w:r>
-        <w:t xml:space="preserve"> </w:t>
-      </w:r>
-      <w:hyperlink w:anchor="ref-npjcompmat2025">
+        <w:t xml:space="preserve"> </w:t>
+      </w:r>
+      <w:r>
+        <w:t xml:space="preserve">codifies the qualitative fragment priors (nitrogen-rich heterocycles, nitramines, azides) on which our motif-augmented training set is built.</w:t>
+      </w:r>
+    </w:p>
+    <w:p>
+      <w:pPr>
+        <w:pStyle w:val="MDPI22heading2"/>
+        <w:ind w:left="2608"/>
+      </w:pPr>
+      <w:r>
+        <w:t xml:space="preserve">1.1.5 Energetic-materials generative ML and synthesisability</w:t>
+      </w:r>
+    </w:p>
+    <w:p>
+      <w:pPr>
+        <w:pStyle w:val="MDPI32textnoindent"/>
+        <w:ind w:left="2608"/>
+      </w:pPr>
+      <w:r>
+        <w:t xml:space="preserve">Generative work targeting the energetic-materials high-energy tail is comparatively recent and is constrained by the small size of the labelled corpus. The closest spiritual analogue to DGLD is the constrained Bayesian optimisation in a VAE latent of Griffiths and Hernández-Lobato</w:t>
+      </w:r>
+      <w:r>
+        <w:t xml:space="preserve"> </w:t>
+      </w:r>
+      <w:hyperlink w:anchor="ref-griffiths2020constrained">
         <w:r>
           <w:rPr>
             <w:rStyle w:val="Hyperlink"/>
@@ -2703,84 +2689,26 @@
         </w:r>
       </w:hyperlink>
       <w:r>
-        <w:t xml:space="preserve"> </w:t>
-      </w:r>
-      <w:r>
-        <w:t xml:space="preserve">(npj Computational Materials, in press), which couples an autoregressive SMILES generator to QM validation on energetic targets. The two methods differ on three axes that shape the headline numbers: (i) the prior is autoregressive RNN over SMILES vs latent diffusion over a frozen LIMO encoder, so DGLD trades exact-validity guarantees for property-targeted concentration on the high-tail manifold; (ii) the supervisory signal is property regression on a single tier vs the four-tier trust-gating recipe of Section 4.1, which keeps the ~47k Tier-D rows in the unconditional prior without contaminating the conditional gradient; (iii) the validation funnel is QM-only vs the four-stage SMARTS</w:t>
-      </w:r>
-      <w:r>
-        <w:t xml:space="preserve"> </w:t>
-      </w:r>
-      <m:oMath>
-        <m:r>
-          <m:rPr>
-            <m:sty m:val="p"/>
-          </m:rPr>
-          <m:t>→</m:t>
-        </m:r>
-      </m:oMath>
-      <w:r>
-        <w:t xml:space="preserve"> </w:t>
-      </w:r>
-      <w:r>
-        <w:t xml:space="preserve">Pareto</w:t>
-      </w:r>
-      <w:r>
-        <w:t xml:space="preserve"> </w:t>
-      </w:r>
-      <m:oMath>
-        <m:r>
-          <m:rPr>
-            <m:sty m:val="p"/>
-          </m:rPr>
-          <m:t>→</m:t>
-        </m:r>
-      </m:oMath>
-      <w:r>
-        <w:t xml:space="preserve"> </w:t>
-      </w:r>
-      <w:r>
-        <w:t xml:space="preserve">GFN2-xTB</w:t>
-      </w:r>
-      <w:r>
-        <w:t xml:space="preserve"> </w:t>
-      </w:r>
-      <m:oMath>
-        <m:r>
-          <m:rPr>
-            <m:sty m:val="p"/>
-          </m:rPr>
-          <m:t>→</m:t>
-        </m:r>
-      </m:oMath>
-      <w:r>
-        <w:t xml:space="preserve"> </w:t>
-      </w:r>
-      <w:r>
-        <w:t xml:space="preserve">DFT chain of Section 4.13. Where the two papers agree is on the headline finding that energetic-materials generation requires post-decode physics validation; where they differ is on whether the prior should be tilted toward the high-tail before that validation runs.</w:t>
-      </w:r>
-    </w:p>
-    <w:p>
-      <w:pPr>
-        <w:pStyle w:val="MDPI22heading2"/>
-        <w:ind w:left="2608"/>
-      </w:pPr>
-      <w:r>
-        <w:t xml:space="preserve">1.1.6 General-purpose property predictors</w:t>
-      </w:r>
-    </w:p>
-    <w:p>
-      <w:pPr>
-        <w:pStyle w:val="MDPI32textnoindent"/>
-        <w:ind w:left="2608"/>
-      </w:pPr>
-      <w:r>
-        <w:t xml:space="preserve">Outside the energetic-materials niche, several general-purpose molecular property predictors set the methodological context. Chemprop / D-MPNN</w:t>
-      </w:r>
-      <w:r>
-        <w:t xml:space="preserve"> </w:t>
-      </w:r>
-      <w:hyperlink w:anchor="ref-yang2019chemprop">
+        <w:t xml:space="preserve">, which navigates a learned molecular prior under chemistry constraints; classifier-free latent diffusion subsumes this recipe in a single end-to-end model whose gradient comes from the score function rather than from a separately-trained acquisition oracle. The performance/stability balancing study of Huang et al.</w:t>
+      </w:r>
+      <w:r>
+        <w:t xml:space="preserve"> </w:t>
+      </w:r>
+      <w:hyperlink w:anchor="ref-huang2021applying">
+        <w:r>
+          <w:rPr>
+            <w:rStyle w:val="Hyperlink"/>
+          </w:rPr>
+          <w:t xml:space="preserve">[44]</w:t>
+        </w:r>
+      </w:hyperlink>
+      <w:r>
+        <w:t xml:space="preserve">, already cited above for sensitivity prediction, is the property-prediction-side counterpart of the multi-head trade-off DGLD enforces at generation time. The bulk of the prior ML work on energetic materials has been discriminative; the four-tier label hierarchy and tier-stratified conditioning-mask of Section 4 are designed precisely to make property-targeted generation viable in this small-and-noisy-label regime. The most direct contemporary competitor is the property-conditioned RNN of</w:t>
+      </w:r>
+      <w:r>
+        <w:t xml:space="preserve"> </w:t>
+      </w:r>
+      <w:hyperlink w:anchor="ref-npjcompmat2025">
         <w:r>
           <w:rPr>
             <w:rStyle w:val="Hyperlink"/>
@@ -2792,12 +2720,81 @@
         <w:t xml:space="preserve"> </w:t>
       </w:r>
       <w:r>
-        <w:t xml:space="preserve">remains a strong message-passing-graph default; SchNet</w:t>
-      </w:r>
-      <w:r>
-        <w:t xml:space="preserve"> </w:t>
-      </w:r>
-      <w:hyperlink w:anchor="ref-schutt2018schnet">
+        <w:t xml:space="preserve">(npj Computational Materials, in press), which couples an autoregressive SMILES generator to QM validation on energetic targets. The two methods differ on three axes that shape the headline numbers: (i) the prior is autoregressive RNN over SMILES vs latent diffusion over a frozen LIMO encoder, so DGLD trades exact-validity guarantees for property-targeted concentration on the high-tail manifold; (ii) the supervisory signal is property regression on a single tier vs the four-tier trust-gating recipe of Section 4.1, which keeps the ~47k Tier-D rows in the unconditional prior without contaminating the conditional gradient; (iii) the validation funnel is QM-only vs the four-stage SMARTS</w:t>
+      </w:r>
+      <w:r>
+        <w:t xml:space="preserve"> </w:t>
+      </w:r>
+      <m:oMath>
+        <m:r>
+          <m:rPr>
+            <m:sty m:val="p"/>
+          </m:rPr>
+          <m:t>→</m:t>
+        </m:r>
+      </m:oMath>
+      <w:r>
+        <w:t xml:space="preserve"> </w:t>
+      </w:r>
+      <w:r>
+        <w:t xml:space="preserve">Pareto</w:t>
+      </w:r>
+      <w:r>
+        <w:t xml:space="preserve"> </w:t>
+      </w:r>
+      <m:oMath>
+        <m:r>
+          <m:rPr>
+            <m:sty m:val="p"/>
+          </m:rPr>
+          <m:t>→</m:t>
+        </m:r>
+      </m:oMath>
+      <w:r>
+        <w:t xml:space="preserve"> </w:t>
+      </w:r>
+      <w:r>
+        <w:t xml:space="preserve">GFN2-xTB</w:t>
+      </w:r>
+      <w:r>
+        <w:t xml:space="preserve"> </w:t>
+      </w:r>
+      <m:oMath>
+        <m:r>
+          <m:rPr>
+            <m:sty m:val="p"/>
+          </m:rPr>
+          <m:t>→</m:t>
+        </m:r>
+      </m:oMath>
+      <w:r>
+        <w:t xml:space="preserve"> </w:t>
+      </w:r>
+      <w:r>
+        <w:t xml:space="preserve">DFT chain of Section 4.13. Where the two papers agree is on the headline finding that energetic-materials generation requires post-decode physics validation; where they differ is on whether the prior should be tilted toward the high-tail before that validation runs.</w:t>
+      </w:r>
+    </w:p>
+    <w:p>
+      <w:pPr>
+        <w:pStyle w:val="MDPI22heading2"/>
+        <w:ind w:left="2608"/>
+      </w:pPr>
+      <w:r>
+        <w:t xml:space="preserve">1.1.6 General-purpose property predictors</w:t>
+      </w:r>
+    </w:p>
+    <w:p>
+      <w:pPr>
+        <w:pStyle w:val="MDPI32textnoindent"/>
+        <w:ind w:left="2608"/>
+      </w:pPr>
+      <w:r>
+        <w:t xml:space="preserve">Outside the energetic-materials niche, several general-purpose molecular property predictors set the methodological context. Chemprop / D-MPNN</w:t>
+      </w:r>
+      <w:r>
+        <w:t xml:space="preserve"> </w:t>
+      </w:r>
+      <w:hyperlink w:anchor="ref-yang2019chemprop">
         <w:r>
           <w:rPr>
             <w:rStyle w:val="Hyperlink"/>
@@ -2809,12 +2806,12 @@
         <w:t xml:space="preserve"> </w:t>
       </w:r>
       <w:r>
-        <w:t xml:space="preserve">introduced continuous-filter convolutions for atomistic systems and achieves DFT-level accuracy on energy and force predictions; OrbNet</w:t>
-      </w:r>
-      <w:r>
-        <w:t xml:space="preserve"> </w:t>
-      </w:r>
-      <w:hyperlink w:anchor="ref-qiao2020orbnet">
+        <w:t xml:space="preserve">remains a strong message-passing-graph default; SchNet</w:t>
+      </w:r>
+      <w:r>
+        <w:t xml:space="preserve"> </w:t>
+      </w:r>
+      <w:hyperlink w:anchor="ref-schutt2018schnet">
         <w:r>
           <w:rPr>
             <w:rStyle w:val="Hyperlink"/>
@@ -2826,30 +2823,12 @@
         <w:t xml:space="preserve"> </w:t>
       </w:r>
       <w:r>
-        <w:t xml:space="preserve">uses symmetry-adapted atomic-orbital features to predict quantum-chemical observables at semi-empirical cost. We do not use these networks directly: the smoke-model Uni-Mol ensemble is trained against detonation outputs and is in-distribution for the energetic-materials task, while these graph and quantum-aware models would have to be re-fit to detonation labels before they could substitute for it. They define the broader prediction-quality envelope against which the smoke-model ensemble's accuracy on CHNO chemistry should be read.</w:t>
-      </w:r>
-    </w:p>
-    <w:p>
-      <w:pPr>
-        <w:pStyle w:val="MDPI22heading2"/>
-        <w:ind w:left="2608"/>
-      </w:pPr>
-      <w:r>
-        <w:t xml:space="preserve">1.1.7 Distribution-learning benchmarks and synthesisability metrics</w:t>
-      </w:r>
-    </w:p>
-    <w:p>
-      <w:pPr>
-        <w:pStyle w:val="MDPI32textnoindent"/>
-        <w:ind w:left="2608"/>
-      </w:pPr>
-      <w:r>
-        <w:t xml:space="preserve">The MOSES</w:t>
-      </w:r>
-      <w:r>
-        <w:t xml:space="preserve"> </w:t>
-      </w:r>
-      <w:hyperlink w:anchor="ref-polykovskiy2020moses">
+        <w:t xml:space="preserve">introduced continuous-filter convolutions for atomistic systems and achieves DFT-level accuracy on energy and force predictions; OrbNet</w:t>
+      </w:r>
+      <w:r>
+        <w:t xml:space="preserve"> </w:t>
+      </w:r>
+      <w:hyperlink w:anchor="ref-qiao2020orbnet">
         <w:r>
           <w:rPr>
             <w:rStyle w:val="Hyperlink"/>
@@ -2861,12 +2840,30 @@
         <w:t xml:space="preserve"> </w:t>
       </w:r>
       <w:r>
-        <w:t xml:space="preserve">and GuacaMol</w:t>
-      </w:r>
-      <w:r>
-        <w:t xml:space="preserve"> </w:t>
-      </w:r>
-      <w:hyperlink w:anchor="ref-brown2019guacamol">
+        <w:t xml:space="preserve">uses symmetry-adapted atomic-orbital features to predict quantum-chemical observables at semi-empirical cost. We do not use these networks directly: the smoke-model Uni-Mol ensemble is trained against detonation outputs and is in-distribution for the energetic-materials task, while these graph and quantum-aware models would have to be re-fit to detonation labels before they could substitute for it. They define the broader prediction-quality envelope against which the smoke-model ensemble's accuracy on CHNO chemistry should be read.</w:t>
+      </w:r>
+    </w:p>
+    <w:p>
+      <w:pPr>
+        <w:pStyle w:val="MDPI22heading2"/>
+        <w:ind w:left="2608"/>
+      </w:pPr>
+      <w:r>
+        <w:t xml:space="preserve">1.1.7 Distribution-learning benchmarks and synthesisability metrics</w:t>
+      </w:r>
+    </w:p>
+    <w:p>
+      <w:pPr>
+        <w:pStyle w:val="MDPI32textnoindent"/>
+        <w:ind w:left="2608"/>
+      </w:pPr>
+      <w:r>
+        <w:t xml:space="preserve">The MOSES</w:t>
+      </w:r>
+      <w:r>
+        <w:t xml:space="preserve"> </w:t>
+      </w:r>
+      <w:hyperlink w:anchor="ref-polykovskiy2020moses">
         <w:r>
           <w:rPr>
             <w:rStyle w:val="Hyperlink"/>
@@ -2878,12 +2875,12 @@
         <w:t xml:space="preserve"> </w:t>
       </w:r>
       <w:r>
-        <w:t xml:space="preserve">benchmarks have standardised the evaluation of molecular generators on validity, novelty, uniqueness, and similarity-to-training metrics. The Fréchet ChemNet Distance</w:t>
-      </w:r>
-      <w:r>
-        <w:t xml:space="preserve"> </w:t>
-      </w:r>
-      <w:hyperlink w:anchor="ref-preuer2018fcd">
+        <w:t xml:space="preserve">and GuacaMol</w:t>
+      </w:r>
+      <w:r>
+        <w:t xml:space="preserve"> </w:t>
+      </w:r>
+      <w:hyperlink w:anchor="ref-brown2019guacamol">
         <w:r>
           <w:rPr>
             <w:rStyle w:val="Hyperlink"/>
@@ -2895,12 +2892,12 @@
         <w:t xml:space="preserve"> </w:t>
       </w:r>
       <w:r>
-        <w:t xml:space="preserve">reports distributional similarity between generated and reference sets in a learned chemical-feature space and provides a pretrained-feature analogue of FID for chemistry. The chemical-space project of Reymond</w:t>
-      </w:r>
-      <w:r>
-        <w:t xml:space="preserve"> </w:t>
-      </w:r>
-      <w:hyperlink w:anchor="ref-reymond2015gdb">
+        <w:t xml:space="preserve">benchmarks have standardised the evaluation of molecular generators on validity, novelty, uniqueness, and similarity-to-training metrics. The Fréchet ChemNet Distance</w:t>
+      </w:r>
+      <w:r>
+        <w:t xml:space="preserve"> </w:t>
+      </w:r>
+      <w:hyperlink w:anchor="ref-preuer2018fcd">
         <w:r>
           <w:rPr>
             <w:rStyle w:val="Hyperlink"/>
@@ -2909,12 +2906,15 @@
         </w:r>
       </w:hyperlink>
       <w:r>
-        <w:t xml:space="preserve">, with its enumerated GDB-13 and GDB-17 reference sets, bounds how much of small-molecule space remains untouched by generative models and contextualises any novelty claim. We adopt MOSES-style metrics in Supplementary Section D.11 and treat FCD as a chemistry-class-transfer signal rather than a within-domain quality metric, since the ChemNet feature extractor is trained on drug-like ZINC</w:t>
-      </w:r>
-      <w:r>
-        <w:t xml:space="preserve"> </w:t>
-      </w:r>
-      <w:hyperlink w:anchor="ref-sterling2015zinc">
+        <w:t xml:space="preserve"> </w:t>
+      </w:r>
+      <w:r>
+        <w:t xml:space="preserve">reports distributional similarity between generated and reference sets in a learned chemical-feature space and provides a pretrained-feature analogue of FID for chemistry. The chemical-space project of Reymond</w:t>
+      </w:r>
+      <w:r>
+        <w:t xml:space="preserve"> </w:t>
+      </w:r>
+      <w:hyperlink w:anchor="ref-reymond2015gdb">
         <w:r>
           <w:rPr>
             <w:rStyle w:val="Hyperlink"/>
@@ -2923,21 +2923,12 @@
         </w:r>
       </w:hyperlink>
       <w:r>
-        <w:t xml:space="preserve">+PubChem chemistry.</w:t>
-      </w:r>
-    </w:p>
-    <w:p>
-      <w:pPr>
-        <w:pStyle w:val="MDPI31text"/>
-        <w:ind w:left="2608"/>
-      </w:pPr>
-      <w:r>
-        <w:t xml:space="preserve">Synthesisability is a separate concern. The SA score of Ertl and Schuffenhauer</w:t>
-      </w:r>
-      <w:r>
-        <w:t xml:space="preserve"> </w:t>
-      </w:r>
-      <w:hyperlink w:anchor="ref-ertl2009sa">
+        <w:t xml:space="preserve">, with its enumerated GDB-13 and GDB-17 reference sets, bounds how much of small-molecule space remains untouched by generative models and contextualises any novelty claim. We adopt MOSES-style metrics in Supplementary Section D.11 and treat FCD as a chemistry-class-transfer signal rather than a within-domain quality metric, since the ChemNet feature extractor is trained on drug-like ZINC</w:t>
+      </w:r>
+      <w:r>
+        <w:t xml:space="preserve"> </w:t>
+      </w:r>
+      <w:hyperlink w:anchor="ref-sterling2015zinc">
         <w:r>
           <w:rPr>
             <w:rStyle w:val="Hyperlink"/>
@@ -2946,15 +2937,21 @@
         </w:r>
       </w:hyperlink>
       <w:r>
-        <w:t xml:space="preserve"> </w:t>
-      </w:r>
-      <w:r>
-        <w:t xml:space="preserve">penalises uncommon ring fusions and rare fragments and is a fast, well-calibrated bound on accessibility; the SCScore of Coley et al.</w:t>
-      </w:r>
-      <w:r>
-        <w:t xml:space="preserve"> </w:t>
-      </w:r>
-      <w:hyperlink w:anchor="ref-coley2018scscore">
+        <w:t xml:space="preserve">+PubChem chemistry.</w:t>
+      </w:r>
+    </w:p>
+    <w:p>
+      <w:pPr>
+        <w:pStyle w:val="MDPI31text"/>
+        <w:ind w:left="2608"/>
+      </w:pPr>
+      <w:r>
+        <w:t xml:space="preserve">Synthesisability is a separate concern. The SA score of Ertl and Schuffenhauer</w:t>
+      </w:r>
+      <w:r>
+        <w:t xml:space="preserve"> </w:t>
+      </w:r>
+      <w:hyperlink w:anchor="ref-ertl2009sa">
         <w:r>
           <w:rPr>
             <w:rStyle w:val="Hyperlink"/>
@@ -2966,12 +2963,12 @@
         <w:t xml:space="preserve"> </w:t>
       </w:r>
       <w:r>
-        <w:t xml:space="preserve">learns a complexity proxy from a reaction corpus and complements SA by rewarding fragments that appear as reaction products. We apply both as hard caps in the rerank pipeline. Tanimoto similarity</w:t>
-      </w:r>
-      <w:r>
-        <w:t xml:space="preserve"> </w:t>
-      </w:r>
-      <w:hyperlink w:anchor="ref-rogers1960computer">
+        <w:t xml:space="preserve">penalises uncommon ring fusions and rare fragments and is a fast, well-calibrated bound on accessibility; the SCScore of Coley et al.</w:t>
+      </w:r>
+      <w:r>
+        <w:t xml:space="preserve"> </w:t>
+      </w:r>
+      <w:hyperlink w:anchor="ref-coley2018scscore">
         <w:r>
           <w:rPr>
             <w:rStyle w:val="Hyperlink"/>
@@ -2983,46 +2980,12 @@
         <w:t xml:space="preserve"> </w:t>
       </w:r>
       <w:r>
-        <w:t xml:space="preserve">on Morgan fingerprints provides a simple, well-understood novelty bound against the training set; we use a window</w:t>
-      </w:r>
-      <w:r>
-        <w:t xml:space="preserve"> </w:t>
-      </w:r>
-      <w:r>
-        <w:rPr>
-          <w:i/>
-          <w:iCs/>
-        </w:rPr>
-        <w:t xml:space="preserve">(0.20, 0.55)</w:t>
-      </w:r>
-      <w:r>
-        <w:t xml:space="preserve"> </w:t>
-      </w:r>
-      <w:r>
-        <w:t xml:space="preserve">to keep candidates close enough to known chemistry to be plausible but far enough to count as new.</w:t>
-      </w:r>
-    </w:p>
-    <w:p>
-      <w:pPr>
-        <w:pStyle w:val="MDPI22heading2"/>
-        <w:ind w:left="2608"/>
-      </w:pPr>
-      <w:r>
-        <w:t xml:space="preserve">1.1.8 Validation tooling</w:t>
-      </w:r>
-    </w:p>
-    <w:p>
-      <w:pPr>
-        <w:pStyle w:val="MDPI32textnoindent"/>
-        <w:ind w:left="2608"/>
-      </w:pPr>
-      <w:r>
-        <w:t xml:space="preserve">The validation half of the DGLD pipeline relies on three external tools that are not part of the generative-modelling literature. GFN2-xTB</w:t>
-      </w:r>
-      <w:r>
-        <w:t xml:space="preserve"> </w:t>
-      </w:r>
-      <w:hyperlink w:anchor="ref-bannwarth2019gfn2">
+        <w:t xml:space="preserve">learns a complexity proxy from a reaction corpus and complements SA by rewarding fragments that appear as reaction products. We apply both as hard caps in the rerank pipeline. Tanimoto similarity</w:t>
+      </w:r>
+      <w:r>
+        <w:t xml:space="preserve"> </w:t>
+      </w:r>
+      <w:hyperlink w:anchor="ref-rogers1960computer">
         <w:r>
           <w:rPr>
             <w:rStyle w:val="Hyperlink"/>
@@ -3034,12 +2997,46 @@
         <w:t xml:space="preserve"> </w:t>
       </w:r>
       <w:r>
-        <w:t xml:space="preserve">is the semi-empirical tight-binding method we use for sample-time HOMO–LUMO gap triage on top leads (Section 2.3, Supplementary Section C.12); it runs in seconds per molecule on CPU, is well-calibrated for organic CHNO, and provides a stability proxy that is independent of the Uni-Mol surrogate's training distribution. The gpu4pyscf bindings on top of the PySCF framework</w:t>
-      </w:r>
-      <w:r>
-        <w:t xml:space="preserve"> </w:t>
-      </w:r>
-      <w:hyperlink w:anchor="ref-sun2020pyscf">
+        <w:t xml:space="preserve">on Morgan fingerprints provides a simple, well-understood novelty bound against the training set; we use a window</w:t>
+      </w:r>
+      <w:r>
+        <w:t xml:space="preserve"> </w:t>
+      </w:r>
+      <w:r>
+        <w:rPr>
+          <w:i/>
+          <w:iCs/>
+        </w:rPr>
+        <w:t xml:space="preserve">(0.20, 0.55)</w:t>
+      </w:r>
+      <w:r>
+        <w:t xml:space="preserve"> </w:t>
+      </w:r>
+      <w:r>
+        <w:t xml:space="preserve">to keep candidates close enough to known chemistry to be plausible but far enough to count as new.</w:t>
+      </w:r>
+    </w:p>
+    <w:p>
+      <w:pPr>
+        <w:pStyle w:val="MDPI22heading2"/>
+        <w:ind w:left="2608"/>
+      </w:pPr>
+      <w:r>
+        <w:t xml:space="preserve">1.1.8 Validation tooling</w:t>
+      </w:r>
+    </w:p>
+    <w:p>
+      <w:pPr>
+        <w:pStyle w:val="MDPI32textnoindent"/>
+        <w:ind w:left="2608"/>
+      </w:pPr>
+      <w:r>
+        <w:t xml:space="preserve">The validation half of the DGLD pipeline relies on three external tools that are not part of the generative-modelling literature. GFN2-xTB</w:t>
+      </w:r>
+      <w:r>
+        <w:t xml:space="preserve"> </w:t>
+      </w:r>
+      <w:hyperlink w:anchor="ref-bannwarth2019gfn2">
         <w:r>
           <w:rPr>
             <w:rStyle w:val="Hyperlink"/>
@@ -3051,12 +3048,12 @@
         <w:t xml:space="preserve"> </w:t>
       </w:r>
       <w:r>
-        <w:t xml:space="preserve">supply our DFT pipeline (Section 2.3, Supplementary Section C). GPU offloading reduces a single B3LYP/6-31G(d) opt + Hessian for a 15–25-atom CHNO molecule from hours on CPU to under one hour on a single A100, which is what makes per-lead first-principles validation budget-feasible. AiZynthFinder</w:t>
-      </w:r>
-      <w:r>
-        <w:t xml:space="preserve"> </w:t>
-      </w:r>
-      <w:hyperlink w:anchor="ref-genheden2020aizynth">
+        <w:t xml:space="preserve">is the semi-empirical tight-binding method we use for sample-time HOMO–LUMO gap triage on top leads (Section 2.3, Supplementary Section C.12); it runs in seconds per molecule on CPU, is well-calibrated for organic CHNO, and provides a stability proxy that is independent of the Uni-Mol surrogate's training distribution. The gpu4pyscf bindings on top of the PySCF framework</w:t>
+      </w:r>
+      <w:r>
+        <w:t xml:space="preserve"> </w:t>
+      </w:r>
+      <w:hyperlink w:anchor="ref-sun2020pyscf">
         <w:r>
           <w:rPr>
             <w:rStyle w:val="Hyperlink"/>
@@ -3068,6 +3065,23 @@
         <w:t xml:space="preserve"> </w:t>
       </w:r>
       <w:r>
+        <w:t xml:space="preserve">supply our DFT pipeline (Section 2.3, Supplementary Section C). GPU offloading reduces a single B3LYP/6-31G(d) opt + Hessian for a 15–25-atom CHNO molecule from hours on CPU to under one hour on a single A100, which is what makes per-lead first-principles validation budget-feasible. AiZynthFinder</w:t>
+      </w:r>
+      <w:r>
+        <w:t xml:space="preserve"> </w:t>
+      </w:r>
+      <w:hyperlink w:anchor="ref-genheden2020aizynth">
+        <w:r>
+          <w:rPr>
+            <w:rStyle w:val="Hyperlink"/>
+          </w:rPr>
+          <w:t xml:space="preserve">[61]</w:t>
+        </w:r>
+      </w:hyperlink>
+      <w:r>
+        <w:t xml:space="preserve"> </w:t>
+      </w:r>
+      <w:r>
         <w:t xml:space="preserve">performs the retrosynthetic plausibility check of Section 2.4 via Monte-Carlo tree search over a USPTO template set against a ZINC in-stock catalog; we treat it as a positive-only check, since an empty result reflects template-database scope rather than unsynthesisability. The accuracy expected of any DFT functional we use is calibrated by the GMTKN55 benchmark suite of Goerigk et al.</w:t>
       </w:r>
       <w:r>
@@ -3078,7 +3092,7 @@
           <w:rPr>
             <w:rStyle w:val="Hyperlink"/>
           </w:rPr>
-          <w:t xml:space="preserve">[61]</w:t>
+          <w:t xml:space="preserve">[62]</w:t>
         </w:r>
       </w:hyperlink>
       <w:r>
@@ -8793,7 +8807,7 @@
           <w:rPr>
             <w:rStyle w:val="Hyperlink"/>
           </w:rPr>
-          <w:t xml:space="preserve">[62]</w:t>
+          <w:t xml:space="preserve">[63]</w:t>
         </w:r>
       </w:hyperlink>
       <w:hyperlink w:anchor="ref-konnov2025nitroisoxazole">
@@ -8801,7 +8815,7 @@
           <w:rPr>
             <w:rStyle w:val="Hyperlink"/>
           </w:rPr>
-          <w:t xml:space="preserve">[63]</w:t>
+          <w:t xml:space="preserve">[64]</w:t>
         </w:r>
       </w:hyperlink>
       <w:r>
@@ -8821,69 +8835,6 @@
         <w:t xml:space="preserve"> </w:t>
       </w:r>
       <w:hyperlink w:anchor="ref-herve2010">
-        <w:r>
-          <w:rPr>
-            <w:rStyle w:val="Hyperlink"/>
-          </w:rPr>
-          <w:t xml:space="preserve">[64]</w:t>
-        </w:r>
-      </w:hyperlink>
-      <w:r>
-        <w:t xml:space="preserve"> </w:t>
-      </w:r>
-      <w:r>
-        <w:t xml:space="preserve">is the closest fully-substituted ring previously characterised. The 3,4,5-trinitro-1,2-isoxazole isomer DGLD proposes is absent from the 65 980-row labelled master (max-Tanimoto 0.27) and from PubChem; it is therefore a chemotype-class rediscovery with a positionally novel substitution pattern.</w:t>
-      </w:r>
-    </w:p>
-    <w:p>
-      <w:pPr>
-        <w:pStyle w:val="MDPI22heading2"/>
-        <w:ind w:left="2608"/>
-      </w:pPr>
-      <w:r>
-        <w:t xml:space="preserve">2.4 Novelty, synthesisability, and scaffold diversity</w:t>
-      </w:r>
-    </w:p>
-    <w:p>
-      <w:pPr>
-        <w:pStyle w:val="MDPI32textnoindent"/>
-        <w:ind w:left="2608"/>
-      </w:pPr>
-      <w:r>
-        <w:t xml:space="preserve">Three audits frame the merged top-100 against PubChem, public USPTO retrosynthesis templates, and a scaffold-distinct E-set extension. A scaffold-diversity audit shows DGLD spans a chemotype distribution (the scaffold-distinct E-set extension, E1–E10: 10 DFT leads / 8 Bemis–Murcko scaffolds / 7 families), not a single isoxazole hit.</w:t>
-      </w:r>
-    </w:p>
-    <w:p>
-      <w:pPr>
-        <w:pStyle w:val="MDPI23heading3"/>
-        <w:ind w:left="2608"/>
-      </w:pPr>
-      <w:r>
-        <w:t xml:space="preserve">Novelty audit</w:t>
-      </w:r>
-    </w:p>
-    <w:p>
-      <w:pPr>
-        <w:pStyle w:val="MDPI32textnoindent"/>
-        <w:ind w:left="2608"/>
-      </w:pPr>
-      <w:r>
-        <w:t xml:space="preserve">Of the merged top-100,</w:t>
-      </w:r>
-      <w:r>
-        <w:t xml:space="preserve"> </w:t>
-      </w:r>
-      <w:r>
-        <w:rPr>
-          <w:b/>
-          <w:bCs/>
-        </w:rPr>
-        <w:t xml:space="preserve">96/97 are absent from PubChem</w:t>
-      </w:r>
-      <w:r>
-        <w:t xml:space="preserve"> </w:t>
-      </w:r>
-      <w:hyperlink w:anchor="ref-kim2023pubchem">
         <w:r>
           <w:rPr>
             <w:rStyle w:val="Hyperlink"/>
@@ -8895,6 +8846,69 @@
         <w:t xml:space="preserve"> </w:t>
       </w:r>
       <w:r>
+        <w:t xml:space="preserve">is the closest fully-substituted ring previously characterised. The 3,4,5-trinitro-1,2-isoxazole isomer DGLD proposes is absent from the 65 980-row labelled master (max-Tanimoto 0.27) and from PubChem; it is therefore a chemotype-class rediscovery with a positionally novel substitution pattern.</w:t>
+      </w:r>
+    </w:p>
+    <w:p>
+      <w:pPr>
+        <w:pStyle w:val="MDPI22heading2"/>
+        <w:ind w:left="2608"/>
+      </w:pPr>
+      <w:r>
+        <w:t xml:space="preserve">2.4 Novelty, synthesisability, and scaffold diversity</w:t>
+      </w:r>
+    </w:p>
+    <w:p>
+      <w:pPr>
+        <w:pStyle w:val="MDPI32textnoindent"/>
+        <w:ind w:left="2608"/>
+      </w:pPr>
+      <w:r>
+        <w:t xml:space="preserve">Three audits frame the merged top-100 against PubChem, public USPTO retrosynthesis templates, and a scaffold-distinct E-set extension. A scaffold-diversity audit shows DGLD spans a chemotype distribution (the scaffold-distinct E-set extension, E1–E10: 10 DFT leads / 8 Bemis–Murcko scaffolds / 7 families), not a single isoxazole hit.</w:t>
+      </w:r>
+    </w:p>
+    <w:p>
+      <w:pPr>
+        <w:pStyle w:val="MDPI23heading3"/>
+        <w:ind w:left="2608"/>
+      </w:pPr>
+      <w:r>
+        <w:t xml:space="preserve">Novelty audit</w:t>
+      </w:r>
+    </w:p>
+    <w:p>
+      <w:pPr>
+        <w:pStyle w:val="MDPI32textnoindent"/>
+        <w:ind w:left="2608"/>
+      </w:pPr>
+      <w:r>
+        <w:t xml:space="preserve">Of the merged top-100,</w:t>
+      </w:r>
+      <w:r>
+        <w:t xml:space="preserve"> </w:t>
+      </w:r>
+      <w:r>
+        <w:rPr>
+          <w:b/>
+          <w:bCs/>
+        </w:rPr>
+        <w:t xml:space="preserve">96/97 are absent from PubChem</w:t>
+      </w:r>
+      <w:r>
+        <w:t xml:space="preserve"> </w:t>
+      </w:r>
+      <w:hyperlink w:anchor="ref-kim2023pubchem">
+        <w:r>
+          <w:rPr>
+            <w:rStyle w:val="Hyperlink"/>
+          </w:rPr>
+          <w:t xml:space="preserve">[66]</w:t>
+        </w:r>
+      </w:hyperlink>
+      <w:r>
+        <w:t xml:space="preserve"> </w:t>
+      </w:r>
+      <w:r>
         <w:t xml:space="preserve">(PUG REST on canonical SMILES; 3 transient REST errors excluded; the one rediscovery is 1-nitro-1H-tetrazol-1-amine at rank 56). Independently,</w:t>
       </w:r>
       <w:r>
@@ -8911,7 +8925,7 @@
         <w:t xml:space="preserve"> </w:t>
       </w:r>
       <w:r>
-        <w:t xml:space="preserve">(Table 3); of the three that do (dinitramide, 1,2-dinitrohydrazine, N,N′-dinitrocarbodiimide), one is an exact match, and all three are established high-density CHNO motifs the model recovers. Novelty here is assessed against PubChem and the labelled master; a full CAS Registry (SciFinder) check is recommended before a formal novelty claim, and the structurally simplest leads (L5, L19) warrant a targeted patent search.</w:t>
+        <w:t xml:space="preserve">(Table 3); of the three that do (dinitramide, 1,2-dinitrohydrazine, N,N′-dinitrocarbodiimide), one is an exact match, and all three are established high-density CHNO motifs the model recovers. Novelty here is assessed against PubChem, the SureChEMBL patent corpus, and the labelled master; all eleven leads are absent from these sources, though a full CAS Registry (SciFinder) check is recommended before a formal novelty claim.</w:t>
       </w:r>
       <w:r>
         <w:t xml:space="preserve"> </w:t>
@@ -9505,7 +9519,7 @@
           <w:rPr>
             <w:rStyle w:val="Hyperlink"/>
           </w:rPr>
-          <w:t xml:space="preserve">[60]</w:t>
+          <w:t xml:space="preserve">[61]</w:t>
         </w:r>
       </w:hyperlink>
       <w:r>
@@ -19295,7 +19309,7 @@
           <w:rPr>
             <w:rStyle w:val="Hyperlink"/>
           </w:rPr>
-          <w:t xml:space="preserve">[66]</w:t>
+          <w:t xml:space="preserve">[67]</w:t>
         </w:r>
       </w:hyperlink>
       <w:r>
@@ -20530,7 +20544,7 @@
           <w:rPr>
             <w:rStyle w:val="Hyperlink"/>
           </w:rPr>
-          <w:t xml:space="preserve">[67]</w:t>
+          <w:t xml:space="preserve">[68]</w:t>
         </w:r>
       </w:hyperlink>
       <w:r>
@@ -21377,7 +21391,7 @@
           <w:rPr>
             <w:rStyle w:val="Hyperlink"/>
           </w:rPr>
-          <w:t xml:space="preserve">[68]</w:t>
+          <w:t xml:space="preserve">[69]</w:t>
         </w:r>
       </w:hyperlink>
       <w:r>
@@ -21562,7 +21576,7 @@
           <w:rPr>
             <w:rStyle w:val="Hyperlink"/>
           </w:rPr>
-          <w:t xml:space="preserve">[10]</w:t>
+          <w:t xml:space="preserve">[11]</w:t>
         </w:r>
       </w:hyperlink>
       <w:r>
@@ -23713,7 +23727,7 @@
           <w:rPr>
             <w:rStyle w:val="Hyperlink"/>
           </w:rPr>
-          <w:t xml:space="preserve">[25]</w:t>
+          <w:t xml:space="preserve">[26]</w:t>
         </w:r>
       </w:hyperlink>
       <w:r>
@@ -24928,7 +24942,7 @@
           <w:rPr>
             <w:rStyle w:val="Hyperlink"/>
           </w:rPr>
-          <w:t xml:space="preserve">[43]</w:t>
+          <w:t xml:space="preserve">[44]</w:t>
         </w:r>
       </w:hyperlink>
       <w:r>
@@ -24989,7 +25003,7 @@
           <w:rPr>
             <w:rStyle w:val="Hyperlink"/>
           </w:rPr>
-          <w:t xml:space="preserve">[69]</w:t>
+          <w:t xml:space="preserve">[70]</w:t>
         </w:r>
       </w:hyperlink>
       <w:r>
@@ -27830,7 +27844,7 @@
           <w:rPr>
             <w:rStyle w:val="Hyperlink"/>
           </w:rPr>
-          <w:t xml:space="preserve">[25]</w:t>
+          <w:t xml:space="preserve">[26]</w:t>
         </w:r>
       </w:hyperlink>
       <w:r>
@@ -28252,7 +28266,7 @@
           <w:rPr>
             <w:rStyle w:val="Hyperlink"/>
           </w:rPr>
-          <w:t xml:space="preserve">[70]</w:t>
+          <w:t xml:space="preserve">[71]</w:t>
         </w:r>
       </w:hyperlink>
       <w:r>
@@ -28269,7 +28283,7 @@
           <w:rPr>
             <w:rStyle w:val="Hyperlink"/>
           </w:rPr>
-          <w:t xml:space="preserve">[55]</w:t>
+          <w:t xml:space="preserve">[56]</w:t>
         </w:r>
       </w:hyperlink>
       <w:r>
@@ -28294,7 +28308,7 @@
           <w:rPr>
             <w:rStyle w:val="Hyperlink"/>
           </w:rPr>
-          <w:t xml:space="preserve">[56]</w:t>
+          <w:t xml:space="preserve">[57]</w:t>
         </w:r>
       </w:hyperlink>
       <w:r>
@@ -29995,7 +30009,7 @@
           <w:rPr>
             <w:rStyle w:val="Hyperlink"/>
           </w:rPr>
-          <w:t xml:space="preserve">[21]</w:t>
+          <w:t xml:space="preserve">[22]</w:t>
         </w:r>
       </w:hyperlink>
       <w:r>
@@ -30803,7 +30817,7 @@
         <w:t xml:space="preserve"> </w:t>
       </w:r>
       <w:r>
-        <w:t xml:space="preserve">L1 meets five criteria for an experimental campaign: it is absent from PubChem and the 65 980-row labelled master, AiZynthFinder finds a 4-step productive route (the energetic-domain intermediates are flagged</w:t>
+        <w:t xml:space="preserve">L1 meets five criteria for an experimental campaign: it is absent from PubChem, SureChEMBL patent structures, and the 65 980-row labelled master, AiZynthFinder finds a 4-step productive route (the energetic-domain intermediates are flagged</w:t>
       </w:r>
       <w:r>
         <w:t xml:space="preserve"> </w:t>
@@ -31004,9 +31018,9 @@
         </w:numPr>
         <w:ind w:left="180" w:hanging="180"/>
       </w:pPr>
-      <w:bookmarkStart w:id="142" w:name="ref-gomez2018automatic"/>
-      <w:r>
-        <w:t xml:space="preserve">Gómez-Bombarelli, R. et al. (2018). Automatic Chemical Design Using a Data-Driven Continuous Representation of Molecules.</w:t>
+      <w:bookmarkStart w:id="142" w:name="ref-surechembl"/>
+      <w:r>
+        <w:t xml:space="preserve">Papadatos, G. et al. (2016). SureChEMBL: a large-scale, chemically annotated patent document database.</w:t>
       </w:r>
       <w:r>
         <w:t xml:space="preserve"> </w:t>
@@ -31016,10 +31030,13 @@
           <w:i/>
           <w:iCs/>
         </w:rPr>
-        <w:t xml:space="preserve">ACS Central Science 4(2)</w:t>
-      </w:r>
-      <w:r>
-        <w:t xml:space="preserve">:268–276. doi:10.1021/acscentsci.7b00572.</w:t>
+        <w:t xml:space="preserve">Nucleic Acids Res.</w:t>
+      </w:r>
+      <w:r>
+        <w:t xml:space="preserve"> </w:t>
+      </w:r>
+      <w:r>
+        <w:t xml:space="preserve">44(D1):D1220–D1228. doi:10.1093/nar/gkv1253.</w:t>
       </w:r>
       <w:bookmarkEnd w:id="142"/>
     </w:p>
@@ -31032,9 +31049,9 @@
         </w:numPr>
         <w:ind w:left="180" w:hanging="180"/>
       </w:pPr>
-      <w:bookmarkStart w:id="143" w:name="ref-jin2018junction"/>
-      <w:r>
-        <w:t xml:space="preserve">Jin, W., Barzilay, R., &amp; Jaakkola, T. (2018). Junction Tree Variational Autoencoder for Molecular Graph Generation.</w:t>
+      <w:bookmarkStart w:id="143" w:name="ref-gomez2018automatic"/>
+      <w:r>
+        <w:t xml:space="preserve">Gómez-Bombarelli, R. et al. (2018). Automatic Chemical Design Using a Data-Driven Continuous Representation of Molecules.</w:t>
       </w:r>
       <w:r>
         <w:t xml:space="preserve"> </w:t>
@@ -31044,10 +31061,10 @@
           <w:i/>
           <w:iCs/>
         </w:rPr>
-        <w:t xml:space="preserve">ICML 2018</w:t>
-      </w:r>
-      <w:r>
-        <w:t xml:space="preserve">. arXiv:1802.04364.</w:t>
+        <w:t xml:space="preserve">ACS Central Science 4(2)</w:t>
+      </w:r>
+      <w:r>
+        <w:t xml:space="preserve">:268–276. doi:10.1021/acscentsci.7b00572.</w:t>
       </w:r>
       <w:bookmarkEnd w:id="143"/>
     </w:p>
@@ -31060,9 +31077,9 @@
         </w:numPr>
         <w:ind w:left="180" w:hanging="180"/>
       </w:pPr>
-      <w:bookmarkStart w:id="144" w:name="ref-winter2019cddd"/>
-      <w:r>
-        <w:t xml:space="preserve">Winter, R., Montanari, F., Noé, F., &amp; Clevert, D.-A. (2019). Learning continuous and data-driven molecular descriptors by translating equivalent chemical representations.</w:t>
+      <w:bookmarkStart w:id="144" w:name="ref-jin2018junction"/>
+      <w:r>
+        <w:t xml:space="preserve">Jin, W., Barzilay, R., &amp; Jaakkola, T. (2018). Junction Tree Variational Autoencoder for Molecular Graph Generation.</w:t>
       </w:r>
       <w:r>
         <w:t xml:space="preserve"> </w:t>
@@ -31072,10 +31089,10 @@
           <w:i/>
           <w:iCs/>
         </w:rPr>
-        <w:t xml:space="preserve">Chem. Sci. 10(6)</w:t>
-      </w:r>
-      <w:r>
-        <w:t xml:space="preserve">:1692–1701. doi:10.1039/C8SC04175J.</w:t>
+        <w:t xml:space="preserve">ICML 2018</w:t>
+      </w:r>
+      <w:r>
+        <w:t xml:space="preserve">. arXiv:1802.04364.</w:t>
       </w:r>
       <w:bookmarkEnd w:id="144"/>
     </w:p>
@@ -31088,9 +31105,9 @@
         </w:numPr>
         <w:ind w:left="180" w:hanging="180"/>
       </w:pPr>
-      <w:bookmarkStart w:id="145" w:name="ref-maziarka2020molcyclegan"/>
-      <w:r>
-        <w:t xml:space="preserve">Maziarka, Ł., Pocha, A., Kaczmarczyk, J., Rataj, K., Danel, T., &amp; Warchoł, M. (2020). Mol-CycleGAN: a generative model for molecular optimization.</w:t>
+      <w:bookmarkStart w:id="145" w:name="ref-winter2019cddd"/>
+      <w:r>
+        <w:t xml:space="preserve">Winter, R., Montanari, F., Noé, F., &amp; Clevert, D.-A. (2019). Learning continuous and data-driven molecular descriptors by translating equivalent chemical representations.</w:t>
       </w:r>
       <w:r>
         <w:t xml:space="preserve"> </w:t>
@@ -31100,10 +31117,10 @@
           <w:i/>
           <w:iCs/>
         </w:rPr>
-        <w:t xml:space="preserve">J. Cheminformatics 12</w:t>
-      </w:r>
-      <w:r>
-        <w:t xml:space="preserve">:2. doi:10.1186/s13321-019-0404-1.</w:t>
+        <w:t xml:space="preserve">Chem. Sci. 10(6)</w:t>
+      </w:r>
+      <w:r>
+        <w:t xml:space="preserve">:1692–1701. doi:10.1039/C8SC04175J.</w:t>
       </w:r>
       <w:bookmarkEnd w:id="145"/>
     </w:p>
@@ -31116,9 +31133,9 @@
         </w:numPr>
         <w:ind w:left="180" w:hanging="180"/>
       </w:pPr>
-      <w:bookmarkStart w:id="146" w:name="ref-krenn2020selfies"/>
-      <w:r>
-        <w:t xml:space="preserve">Krenn, M., Häse, F., Nigam, A., Friederich, P., &amp; Aspuru-Guzik, A. (2020). Self-Referencing Embedded Strings (SELFIES): A 100% Robust Molecular String Representation.</w:t>
+      <w:bookmarkStart w:id="146" w:name="ref-maziarka2020molcyclegan"/>
+      <w:r>
+        <w:t xml:space="preserve">Maziarka, Ł., Pocha, A., Kaczmarczyk, J., Rataj, K., Danel, T., &amp; Warchoł, M. (2020). Mol-CycleGAN: a generative model for molecular optimization.</w:t>
       </w:r>
       <w:r>
         <w:t xml:space="preserve"> </w:t>
@@ -31128,10 +31145,10 @@
           <w:i/>
           <w:iCs/>
         </w:rPr>
-        <w:t xml:space="preserve">Mach. Learn.: Sci. Tech. 1</w:t>
-      </w:r>
-      <w:r>
-        <w:t xml:space="preserve">:045024.</w:t>
+        <w:t xml:space="preserve">J. Cheminformatics 12</w:t>
+      </w:r>
+      <w:r>
+        <w:t xml:space="preserve">:2. doi:10.1186/s13321-019-0404-1.</w:t>
       </w:r>
       <w:bookmarkEnd w:id="146"/>
     </w:p>
@@ -31144,9 +31161,9 @@
         </w:numPr>
         <w:ind w:left="180" w:hanging="180"/>
       </w:pPr>
-      <w:bookmarkStart w:id="147" w:name="ref-eckmann2022limo"/>
-      <w:r>
-        <w:t xml:space="preserve">Eckmann, P., Sun, K., Zhao, B., Feng, M., Gilson, M. K., &amp; Yu, R. (2022). LIMO: Latent Inceptionism for Targeted Molecule Generation.</w:t>
+      <w:bookmarkStart w:id="147" w:name="ref-krenn2020selfies"/>
+      <w:r>
+        <w:t xml:space="preserve">Krenn, M., Häse, F., Nigam, A., Friederich, P., &amp; Aspuru-Guzik, A. (2020). Self-Referencing Embedded Strings (SELFIES): A 100% Robust Molecular String Representation.</w:t>
       </w:r>
       <w:r>
         <w:t xml:space="preserve"> </w:t>
@@ -31156,10 +31173,10 @@
           <w:i/>
           <w:iCs/>
         </w:rPr>
-        <w:t xml:space="preserve">ICML 2022</w:t>
-      </w:r>
-      <w:r>
-        <w:t xml:space="preserve">. arXiv:2206.09010.</w:t>
+        <w:t xml:space="preserve">Mach. Learn.: Sci. Tech. 1</w:t>
+      </w:r>
+      <w:r>
+        <w:t xml:space="preserve">:045024.</w:t>
       </w:r>
       <w:bookmarkEnd w:id="147"/>
     </w:p>
@@ -31172,9 +31189,22 @@
         </w:numPr>
         <w:ind w:left="180" w:hanging="180"/>
       </w:pPr>
-      <w:bookmarkStart w:id="148" w:name="ref-reidenbach2023molmim"/>
-      <w:r>
-        <w:t xml:space="preserve">Reidenbach, D., Livne, M., Ilango, R. K., Gill, M., &amp; Israeli, J. (2023). MolMIM: A Molecular Language Model for Property-Guided Molecule Generation via Mutual Information Machines. (MLDD Workshop, ICLR 2023; arXiv:2208.09016).</w:t>
+      <w:bookmarkStart w:id="148" w:name="ref-eckmann2022limo"/>
+      <w:r>
+        <w:t xml:space="preserve">Eckmann, P., Sun, K., Zhao, B., Feng, M., Gilson, M. K., &amp; Yu, R. (2022). LIMO: Latent Inceptionism for Targeted Molecule Generation.</w:t>
+      </w:r>
+      <w:r>
+        <w:t xml:space="preserve"> </w:t>
+      </w:r>
+      <w:r>
+        <w:rPr>
+          <w:i/>
+          <w:iCs/>
+        </w:rPr>
+        <w:t xml:space="preserve">ICML 2022</w:t>
+      </w:r>
+      <w:r>
+        <w:t xml:space="preserve">. arXiv:2206.09010.</w:t>
       </w:r>
       <w:bookmarkEnd w:id="148"/>
     </w:p>
@@ -31187,22 +31217,9 @@
         </w:numPr>
         <w:ind w:left="180" w:hanging="180"/>
       </w:pPr>
-      <w:bookmarkStart w:id="149" w:name="ref-jaegle2021perceiver"/>
-      <w:r>
-        <w:t xml:space="preserve">Jaegle, A. et al. (2021). Perceiver: General Perception with Iterative Attention.</w:t>
-      </w:r>
-      <w:r>
-        <w:t xml:space="preserve"> </w:t>
-      </w:r>
-      <w:r>
-        <w:rPr>
-          <w:i/>
-          <w:iCs/>
-        </w:rPr>
-        <w:t xml:space="preserve">ICML 2021</w:t>
-      </w:r>
-      <w:r>
-        <w:t xml:space="preserve">. arXiv:2103.03206.</w:t>
+      <w:bookmarkStart w:id="149" w:name="ref-reidenbach2023molmim"/>
+      <w:r>
+        <w:t xml:space="preserve">Reidenbach, D., Livne, M., Ilango, R. K., Gill, M., &amp; Israeli, J. (2023). MolMIM: A Molecular Language Model for Property-Guided Molecule Generation via Mutual Information Machines. (MLDD Workshop, ICLR 2023; arXiv:2208.09016).</w:t>
       </w:r>
       <w:bookmarkEnd w:id="149"/>
     </w:p>
@@ -31215,9 +31232,9 @@
         </w:numPr>
         <w:ind w:left="180" w:hanging="180"/>
       </w:pPr>
-      <w:bookmarkStart w:id="150" w:name="ref-olivecrona2017reinvent"/>
-      <w:r>
-        <w:t xml:space="preserve">Olivecrona, M., Blaschke, T., Engkvist, O., &amp; Chen, H. (2017). Molecular de-novo design through deep reinforcement learning.</w:t>
+      <w:bookmarkStart w:id="150" w:name="ref-jaegle2021perceiver"/>
+      <w:r>
+        <w:t xml:space="preserve">Jaegle, A. et al. (2021). Perceiver: General Perception with Iterative Attention.</w:t>
       </w:r>
       <w:r>
         <w:t xml:space="preserve"> </w:t>
@@ -31227,10 +31244,10 @@
           <w:i/>
           <w:iCs/>
         </w:rPr>
-        <w:t xml:space="preserve">J. Cheminformatics 9</w:t>
-      </w:r>
-      <w:r>
-        <w:t xml:space="preserve">:48. doi:10.1186/s13321-017-0235-x.</w:t>
+        <w:t xml:space="preserve">ICML 2021</w:t>
+      </w:r>
+      <w:r>
+        <w:t xml:space="preserve">. arXiv:2103.03206.</w:t>
       </w:r>
       <w:bookmarkEnd w:id="150"/>
     </w:p>
@@ -31243,9 +31260,9 @@
         </w:numPr>
         <w:ind w:left="180" w:hanging="180"/>
       </w:pPr>
-      <w:bookmarkStart w:id="151" w:name="ref-loeffler2024reinvent4"/>
-      <w:r>
-        <w:t xml:space="preserve">Loeffler, H. H., He, J., Tibo, A., Janet, J. P., Voronov, A., Mervin, L. H., &amp; Engkvist, O. (2024). REINVENT 4: Modern AI-driven generative molecule design.</w:t>
+      <w:bookmarkStart w:id="151" w:name="ref-olivecrona2017reinvent"/>
+      <w:r>
+        <w:t xml:space="preserve">Olivecrona, M., Blaschke, T., Engkvist, O., &amp; Chen, H. (2017). Molecular de-novo design through deep reinforcement learning.</w:t>
       </w:r>
       <w:r>
         <w:t xml:space="preserve"> </w:t>
@@ -31255,10 +31272,10 @@
           <w:i/>
           <w:iCs/>
         </w:rPr>
-        <w:t xml:space="preserve">J. Cheminformatics 16</w:t>
-      </w:r>
-      <w:r>
-        <w:t xml:space="preserve">:20. doi:10.1186/s13321-024-00812-5.</w:t>
+        <w:t xml:space="preserve">J. Cheminformatics 9</w:t>
+      </w:r>
+      <w:r>
+        <w:t xml:space="preserve">:48. doi:10.1186/s13321-017-0235-x.</w:t>
       </w:r>
       <w:bookmarkEnd w:id="151"/>
     </w:p>
@@ -31271,9 +31288,9 @@
         </w:numPr>
         <w:ind w:left="180" w:hanging="180"/>
       </w:pPr>
-      <w:bookmarkStart w:id="152" w:name="ref-yang2017chemts"/>
-      <w:r>
-        <w:t xml:space="preserve">Yang, X., Zhang, J., Yoshizoe, K., Terayama, K., &amp; Tsuda, K. (2017). ChemTS: An efficient python library for de novo molecular generation.</w:t>
+      <w:bookmarkStart w:id="152" w:name="ref-loeffler2024reinvent4"/>
+      <w:r>
+        <w:t xml:space="preserve">Loeffler, H. H., He, J., Tibo, A., Janet, J. P., Voronov, A., Mervin, L. H., &amp; Engkvist, O. (2024). REINVENT 4: Modern AI-driven generative molecule design.</w:t>
       </w:r>
       <w:r>
         <w:t xml:space="preserve"> </w:t>
@@ -31283,10 +31300,10 @@
           <w:i/>
           <w:iCs/>
         </w:rPr>
-        <w:t xml:space="preserve">Sci. Tech. Adv. Mater. 18(1)</w:t>
-      </w:r>
-      <w:r>
-        <w:t xml:space="preserve">:972–976. doi:10.1080/14686996.2017.1401424.</w:t>
+        <w:t xml:space="preserve">J. Cheminformatics 16</w:t>
+      </w:r>
+      <w:r>
+        <w:t xml:space="preserve">:20. doi:10.1186/s13321-024-00812-5.</w:t>
       </w:r>
       <w:bookmarkEnd w:id="152"/>
     </w:p>
@@ -31299,9 +31316,9 @@
         </w:numPr>
         <w:ind w:left="180" w:hanging="180"/>
       </w:pPr>
-      <w:bookmarkStart w:id="153" w:name="ref-bagal2022molgpt"/>
-      <w:r>
-        <w:t xml:space="preserve">Bagal, V., Aggarwal, R., Vinod, P. K., &amp; Priyakumar, U. D. (2022). MolGPT: Molecular Generation Using a Transformer-Decoder Model.</w:t>
+      <w:bookmarkStart w:id="153" w:name="ref-yang2017chemts"/>
+      <w:r>
+        <w:t xml:space="preserve">Yang, X., Zhang, J., Yoshizoe, K., Terayama, K., &amp; Tsuda, K. (2017). ChemTS: An efficient python library for de novo molecular generation.</w:t>
       </w:r>
       <w:r>
         <w:t xml:space="preserve"> </w:t>
@@ -31311,10 +31328,10 @@
           <w:i/>
           <w:iCs/>
         </w:rPr>
-        <w:t xml:space="preserve">J. Chem. Inf. Model. 62(9)</w:t>
-      </w:r>
-      <w:r>
-        <w:t xml:space="preserve">:2064–2076. doi:10.1021/acs.jcim.1c00600.</w:t>
+        <w:t xml:space="preserve">Sci. Tech. Adv. Mater. 18(1)</w:t>
+      </w:r>
+      <w:r>
+        <w:t xml:space="preserve">:972–976. doi:10.1080/14686996.2017.1401424.</w:t>
       </w:r>
       <w:bookmarkEnd w:id="153"/>
     </w:p>
@@ -31327,9 +31344,9 @@
         </w:numPr>
         <w:ind w:left="180" w:hanging="180"/>
       </w:pPr>
-      <w:bookmarkStart w:id="154" w:name="ref-ross2022molformer"/>
-      <w:r>
-        <w:t xml:space="preserve">Ross, J. et al. (2022). Large-Scale Chemical Language Representations Capture Molecular Structure and Properties.</w:t>
+      <w:bookmarkStart w:id="154" w:name="ref-bagal2022molgpt"/>
+      <w:r>
+        <w:t xml:space="preserve">Bagal, V., Aggarwal, R., Vinod, P. K., &amp; Priyakumar, U. D. (2022). MolGPT: Molecular Generation Using a Transformer-Decoder Model.</w:t>
       </w:r>
       <w:r>
         <w:t xml:space="preserve"> </w:t>
@@ -31339,10 +31356,10 @@
           <w:i/>
           <w:iCs/>
         </w:rPr>
-        <w:t xml:space="preserve">Nature Machine Intelligence 4</w:t>
-      </w:r>
-      <w:r>
-        <w:t xml:space="preserve">:1256–1264. doi:10.1038/s42256-022-00580-7.</w:t>
+        <w:t xml:space="preserve">J. Chem. Inf. Model. 62(9)</w:t>
+      </w:r>
+      <w:r>
+        <w:t xml:space="preserve">:2064–2076. doi:10.1021/acs.jcim.1c00600.</w:t>
       </w:r>
       <w:bookmarkEnd w:id="154"/>
     </w:p>
@@ -31355,9 +31372,9 @@
         </w:numPr>
         <w:ind w:left="180" w:hanging="180"/>
       </w:pPr>
-      <w:bookmarkStart w:id="155" w:name="ref-irwin2022chemformer"/>
-      <w:r>
-        <w:t xml:space="preserve">Irwin, R., Dimitriadis, S., He, J., &amp; Bjerrum, E. J. (2022). Chemformer: A Pre-Trained Transformer for Computational Chemistry.</w:t>
+      <w:bookmarkStart w:id="155" w:name="ref-ross2022molformer"/>
+      <w:r>
+        <w:t xml:space="preserve">Ross, J. et al. (2022). Large-Scale Chemical Language Representations Capture Molecular Structure and Properties.</w:t>
       </w:r>
       <w:r>
         <w:t xml:space="preserve"> </w:t>
@@ -31367,10 +31384,10 @@
           <w:i/>
           <w:iCs/>
         </w:rPr>
-        <w:t xml:space="preserve">Mach. Learn.: Sci. Tech. 3</w:t>
-      </w:r>
-      <w:r>
-        <w:t xml:space="preserve">:015022. doi:10.1088/2632-2153/ac3ffb.</w:t>
+        <w:t xml:space="preserve">Nature Machine Intelligence 4</w:t>
+      </w:r>
+      <w:r>
+        <w:t xml:space="preserve">:1256–1264. doi:10.1038/s42256-022-00580-7.</w:t>
       </w:r>
       <w:bookmarkEnd w:id="155"/>
     </w:p>
@@ -31383,9 +31400,9 @@
         </w:numPr>
         <w:ind w:left="180" w:hanging="180"/>
       </w:pPr>
-      <w:bookmarkStart w:id="156" w:name="ref-bengio2021gflownet"/>
-      <w:r>
-        <w:t xml:space="preserve">Bengio, E., Jain, M., Korablyov, M., Precup, D., &amp; Bengio, Y. (2021). Flow Network Based Generative Models for Non-Iterative Diverse Candidate Generation.</w:t>
+      <w:bookmarkStart w:id="156" w:name="ref-irwin2022chemformer"/>
+      <w:r>
+        <w:t xml:space="preserve">Irwin, R., Dimitriadis, S., He, J., &amp; Bjerrum, E. J. (2022). Chemformer: A Pre-Trained Transformer for Computational Chemistry.</w:t>
       </w:r>
       <w:r>
         <w:t xml:space="preserve"> </w:t>
@@ -31395,10 +31412,10 @@
           <w:i/>
           <w:iCs/>
         </w:rPr>
-        <w:t xml:space="preserve">NeurIPS 2021</w:t>
-      </w:r>
-      <w:r>
-        <w:t xml:space="preserve">. arXiv:2106.04399.</w:t>
+        <w:t xml:space="preserve">Mach. Learn.: Sci. Tech. 3</w:t>
+      </w:r>
+      <w:r>
+        <w:t xml:space="preserve">:015022. doi:10.1088/2632-2153/ac3ffb.</w:t>
       </w:r>
       <w:bookmarkEnd w:id="156"/>
     </w:p>
@@ -31411,9 +31428,9 @@
         </w:numPr>
         <w:ind w:left="180" w:hanging="180"/>
       </w:pPr>
-      <w:bookmarkStart w:id="157" w:name="ref-vignac2023digress"/>
-      <w:r>
-        <w:t xml:space="preserve">Vignac, C. et al. (2023). DiGress: Discrete Denoising Diffusion for Graph Generation.</w:t>
+      <w:bookmarkStart w:id="157" w:name="ref-bengio2021gflownet"/>
+      <w:r>
+        <w:t xml:space="preserve">Bengio, E., Jain, M., Korablyov, M., Precup, D., &amp; Bengio, Y. (2021). Flow Network Based Generative Models for Non-Iterative Diverse Candidate Generation.</w:t>
       </w:r>
       <w:r>
         <w:t xml:space="preserve"> </w:t>
@@ -31423,10 +31440,10 @@
           <w:i/>
           <w:iCs/>
         </w:rPr>
-        <w:t xml:space="preserve">ICLR 2023</w:t>
-      </w:r>
-      <w:r>
-        <w:t xml:space="preserve">. arXiv:2209.14734.</w:t>
+        <w:t xml:space="preserve">NeurIPS 2021</w:t>
+      </w:r>
+      <w:r>
+        <w:t xml:space="preserve">. arXiv:2106.04399.</w:t>
       </w:r>
       <w:bookmarkEnd w:id="157"/>
     </w:p>
@@ -31439,9 +31456,9 @@
         </w:numPr>
         <w:ind w:left="180" w:hanging="180"/>
       </w:pPr>
-      <w:bookmarkStart w:id="158" w:name="ref-ho2020ddpm"/>
-      <w:r>
-        <w:t xml:space="preserve">Ho, J., Jain, A., &amp; Abbeel, P. (2020). Denoising Diffusion Probabilistic Models.</w:t>
+      <w:bookmarkStart w:id="158" w:name="ref-vignac2023digress"/>
+      <w:r>
+        <w:t xml:space="preserve">Vignac, C. et al. (2023). DiGress: Discrete Denoising Diffusion for Graph Generation.</w:t>
       </w:r>
       <w:r>
         <w:t xml:space="preserve"> </w:t>
@@ -31451,10 +31468,10 @@
           <w:i/>
           <w:iCs/>
         </w:rPr>
-        <w:t xml:space="preserve">NeurIPS 2020</w:t>
-      </w:r>
-      <w:r>
-        <w:t xml:space="preserve">. arXiv:2006.11239.</w:t>
+        <w:t xml:space="preserve">ICLR 2023</w:t>
+      </w:r>
+      <w:r>
+        <w:t xml:space="preserve">. arXiv:2209.14734.</w:t>
       </w:r>
       <w:bookmarkEnd w:id="158"/>
     </w:p>
@@ -31467,9 +31484,9 @@
         </w:numPr>
         <w:ind w:left="180" w:hanging="180"/>
       </w:pPr>
-      <w:bookmarkStart w:id="159" w:name="ref-song2019score"/>
-      <w:r>
-        <w:t xml:space="preserve">Song, Y., &amp; Ermon, S. (2019). Generative Modeling by Estimating Gradients of the Data Distribution.</w:t>
+      <w:bookmarkStart w:id="159" w:name="ref-ho2020ddpm"/>
+      <w:r>
+        <w:t xml:space="preserve">Ho, J., Jain, A., &amp; Abbeel, P. (2020). Denoising Diffusion Probabilistic Models.</w:t>
       </w:r>
       <w:r>
         <w:t xml:space="preserve"> </w:t>
@@ -31479,10 +31496,10 @@
           <w:i/>
           <w:iCs/>
         </w:rPr>
-        <w:t xml:space="preserve">NeurIPS 2019</w:t>
-      </w:r>
-      <w:r>
-        <w:t xml:space="preserve">. arXiv:1907.05600.</w:t>
+        <w:t xml:space="preserve">NeurIPS 2020</w:t>
+      </w:r>
+      <w:r>
+        <w:t xml:space="preserve">. arXiv:2006.11239.</w:t>
       </w:r>
       <w:bookmarkEnd w:id="159"/>
     </w:p>
@@ -31495,9 +31512,9 @@
         </w:numPr>
         <w:ind w:left="180" w:hanging="180"/>
       </w:pPr>
-      <w:bookmarkStart w:id="160" w:name="ref-song2021sde"/>
-      <w:r>
-        <w:t xml:space="preserve">Song, Y. et al. (2021). Score-Based Generative Modeling through Stochastic Differential Equations.</w:t>
+      <w:bookmarkStart w:id="160" w:name="ref-song2019score"/>
+      <w:r>
+        <w:t xml:space="preserve">Song, Y., &amp; Ermon, S. (2019). Generative Modeling by Estimating Gradients of the Data Distribution.</w:t>
       </w:r>
       <w:r>
         <w:t xml:space="preserve"> </w:t>
@@ -31507,10 +31524,10 @@
           <w:i/>
           <w:iCs/>
         </w:rPr>
-        <w:t xml:space="preserve">ICLR 2021</w:t>
-      </w:r>
-      <w:r>
-        <w:t xml:space="preserve">. arXiv:2011.13456.</w:t>
+        <w:t xml:space="preserve">NeurIPS 2019</w:t>
+      </w:r>
+      <w:r>
+        <w:t xml:space="preserve">. arXiv:1907.05600.</w:t>
       </w:r>
       <w:bookmarkEnd w:id="160"/>
     </w:p>
@@ -31523,9 +31540,9 @@
         </w:numPr>
         <w:ind w:left="180" w:hanging="180"/>
       </w:pPr>
-      <w:bookmarkStart w:id="161" w:name="ref-rombach2022ldm"/>
-      <w:r>
-        <w:t xml:space="preserve">Rombach, R., Blattmann, A., Lorenz, D., Esser, P., &amp; Ommer, B. (2022). High-Resolution Image Synthesis with Latent Diffusion Models.</w:t>
+      <w:bookmarkStart w:id="161" w:name="ref-song2021sde"/>
+      <w:r>
+        <w:t xml:space="preserve">Song, Y. et al. (2021). Score-Based Generative Modeling through Stochastic Differential Equations.</w:t>
       </w:r>
       <w:r>
         <w:t xml:space="preserve"> </w:t>
@@ -31535,10 +31552,10 @@
           <w:i/>
           <w:iCs/>
         </w:rPr>
-        <w:t xml:space="preserve">CVPR 2022</w:t>
-      </w:r>
-      <w:r>
-        <w:t xml:space="preserve">. arXiv:2112.10752.</w:t>
+        <w:t xml:space="preserve">ICLR 2021</w:t>
+      </w:r>
+      <w:r>
+        <w:t xml:space="preserve">. arXiv:2011.13456.</w:t>
       </w:r>
       <w:bookmarkEnd w:id="161"/>
     </w:p>
@@ -31551,9 +31568,9 @@
         </w:numPr>
         <w:ind w:left="180" w:hanging="180"/>
       </w:pPr>
-      <w:bookmarkStart w:id="162" w:name="ref-dhariwal2021diffusion"/>
-      <w:r>
-        <w:t xml:space="preserve">Dhariwal, P., &amp; Nichol, A. (2021). Diffusion Models Beat GANs on Image Synthesis.</w:t>
+      <w:bookmarkStart w:id="162" w:name="ref-rombach2022ldm"/>
+      <w:r>
+        <w:t xml:space="preserve">Rombach, R., Blattmann, A., Lorenz, D., Esser, P., &amp; Ommer, B. (2022). High-Resolution Image Synthesis with Latent Diffusion Models.</w:t>
       </w:r>
       <w:r>
         <w:t xml:space="preserve"> </w:t>
@@ -31563,10 +31580,10 @@
           <w:i/>
           <w:iCs/>
         </w:rPr>
-        <w:t xml:space="preserve">NeurIPS 2021</w:t>
-      </w:r>
-      <w:r>
-        <w:t xml:space="preserve">. arXiv:2105.05233.</w:t>
+        <w:t xml:space="preserve">CVPR 2022</w:t>
+      </w:r>
+      <w:r>
+        <w:t xml:space="preserve">. arXiv:2112.10752.</w:t>
       </w:r>
       <w:bookmarkEnd w:id="162"/>
     </w:p>
@@ -31579,9 +31596,9 @@
         </w:numPr>
         <w:ind w:left="180" w:hanging="180"/>
       </w:pPr>
-      <w:bookmarkStart w:id="163" w:name="ref-perez2018film"/>
-      <w:r>
-        <w:t xml:space="preserve">Perez, E., Strub, F., de Vries, H., Dumoulin, V., &amp; Courville, A. (2018). FiLM: Visual Reasoning with a General Conditioning Layer.</w:t>
+      <w:bookmarkStart w:id="163" w:name="ref-dhariwal2021diffusion"/>
+      <w:r>
+        <w:t xml:space="preserve">Dhariwal, P., &amp; Nichol, A. (2021). Diffusion Models Beat GANs on Image Synthesis.</w:t>
       </w:r>
       <w:r>
         <w:t xml:space="preserve"> </w:t>
@@ -31591,10 +31608,10 @@
           <w:i/>
           <w:iCs/>
         </w:rPr>
-        <w:t xml:space="preserve">AAAI 2018</w:t>
-      </w:r>
-      <w:r>
-        <w:t xml:space="preserve">. arXiv:1709.07871.</w:t>
+        <w:t xml:space="preserve">NeurIPS 2021</w:t>
+      </w:r>
+      <w:r>
+        <w:t xml:space="preserve">. arXiv:2105.05233.</w:t>
       </w:r>
       <w:bookmarkEnd w:id="163"/>
     </w:p>
@@ -31607,9 +31624,9 @@
         </w:numPr>
         <w:ind w:left="180" w:hanging="180"/>
       </w:pPr>
-      <w:bookmarkStart w:id="164" w:name="ref-hoogeboom2022edm"/>
-      <w:r>
-        <w:t xml:space="preserve">Hoogeboom, E., Garcia Satorras, V., Vignac, C., &amp; Welling, M. (2022). Equivariant Diffusion for Molecule Generation in 3D.</w:t>
+      <w:bookmarkStart w:id="164" w:name="ref-perez2018film"/>
+      <w:r>
+        <w:t xml:space="preserve">Perez, E., Strub, F., de Vries, H., Dumoulin, V., &amp; Courville, A. (2018). FiLM: Visual Reasoning with a General Conditioning Layer.</w:t>
       </w:r>
       <w:r>
         <w:t xml:space="preserve"> </w:t>
@@ -31619,10 +31636,10 @@
           <w:i/>
           <w:iCs/>
         </w:rPr>
-        <w:t xml:space="preserve">ICML 2022</w:t>
-      </w:r>
-      <w:r>
-        <w:t xml:space="preserve">. arXiv:2203.17003.</w:t>
+        <w:t xml:space="preserve">AAAI 2018</w:t>
+      </w:r>
+      <w:r>
+        <w:t xml:space="preserve">. arXiv:1709.07871.</w:t>
       </w:r>
       <w:bookmarkEnd w:id="164"/>
     </w:p>
@@ -31635,9 +31652,9 @@
         </w:numPr>
         <w:ind w:left="180" w:hanging="180"/>
       </w:pPr>
-      <w:bookmarkStart w:id="165" w:name="ref-schneuing2022diffsbdd"/>
-      <w:r>
-        <w:t xml:space="preserve">Schneuing, A. et al. (2022). Structure-based Drug Design with Equivariant Diffusion Models.</w:t>
+      <w:bookmarkStart w:id="165" w:name="ref-hoogeboom2022edm"/>
+      <w:r>
+        <w:t xml:space="preserve">Hoogeboom, E., Garcia Satorras, V., Vignac, C., &amp; Welling, M. (2022). Equivariant Diffusion for Molecule Generation in 3D.</w:t>
       </w:r>
       <w:r>
         <w:t xml:space="preserve"> </w:t>
@@ -31647,10 +31664,10 @@
           <w:i/>
           <w:iCs/>
         </w:rPr>
-        <w:t xml:space="preserve">NeurIPS 2022 AI4Science Workshop</w:t>
-      </w:r>
-      <w:r>
-        <w:t xml:space="preserve">. arXiv:2210.13695.</w:t>
+        <w:t xml:space="preserve">ICML 2022</w:t>
+      </w:r>
+      <w:r>
+        <w:t xml:space="preserve">. arXiv:2203.17003.</w:t>
       </w:r>
       <w:bookmarkEnd w:id="165"/>
     </w:p>
@@ -31663,9 +31680,9 @@
         </w:numPr>
         <w:ind w:left="180" w:hanging="180"/>
       </w:pPr>
-      <w:bookmarkStart w:id="166" w:name="ref-guan2023targetdiff"/>
-      <w:r>
-        <w:t xml:space="preserve">Guan, J. et al. (2023). 3D Equivariant Diffusion for Target-Aware Molecule Generation and Affinity Prediction.</w:t>
+      <w:bookmarkStart w:id="166" w:name="ref-schneuing2022diffsbdd"/>
+      <w:r>
+        <w:t xml:space="preserve">Schneuing, A. et al. (2022). Structure-based Drug Design with Equivariant Diffusion Models.</w:t>
       </w:r>
       <w:r>
         <w:t xml:space="preserve"> </w:t>
@@ -31675,10 +31692,10 @@
           <w:i/>
           <w:iCs/>
         </w:rPr>
-        <w:t xml:space="preserve">ICLR 2023</w:t>
-      </w:r>
-      <w:r>
-        <w:t xml:space="preserve">. arXiv:2303.03543.</w:t>
+        <w:t xml:space="preserve">NeurIPS 2022 AI4Science Workshop</w:t>
+      </w:r>
+      <w:r>
+        <w:t xml:space="preserve">. arXiv:2210.13695.</w:t>
       </w:r>
       <w:bookmarkEnd w:id="166"/>
     </w:p>
@@ -31691,9 +31708,9 @@
         </w:numPr>
         <w:ind w:left="180" w:hanging="180"/>
       </w:pPr>
-      <w:bookmarkStart w:id="167" w:name="ref-peng2022pocket2mol"/>
-      <w:r>
-        <w:t xml:space="preserve">Peng, X., Luo, S., Guan, J., Xie, Q., Peng, J., &amp; Ma, J. (2022). Pocket2Mol: Efficient Molecular Sampling Based on 3D Protein Pockets.</w:t>
+      <w:bookmarkStart w:id="167" w:name="ref-guan2023targetdiff"/>
+      <w:r>
+        <w:t xml:space="preserve">Guan, J. et al. (2023). 3D Equivariant Diffusion for Target-Aware Molecule Generation and Affinity Prediction.</w:t>
       </w:r>
       <w:r>
         <w:t xml:space="preserve"> </w:t>
@@ -31703,10 +31720,10 @@
           <w:i/>
           <w:iCs/>
         </w:rPr>
-        <w:t xml:space="preserve">ICML 2022</w:t>
-      </w:r>
-      <w:r>
-        <w:t xml:space="preserve">. arXiv:2205.07249.</w:t>
+        <w:t xml:space="preserve">ICLR 2023</w:t>
+      </w:r>
+      <w:r>
+        <w:t xml:space="preserve">. arXiv:2303.03543.</w:t>
       </w:r>
       <w:bookmarkEnd w:id="167"/>
     </w:p>
@@ -31719,9 +31736,9 @@
         </w:numPr>
         <w:ind w:left="180" w:hanging="180"/>
       </w:pPr>
-      <w:bookmarkStart w:id="168" w:name="ref-corso2023diffdock"/>
-      <w:r>
-        <w:t xml:space="preserve">Corso, G., Stärk, H., Jing, B., Barzilay, R., &amp; Jaakkola, T. (2023). DiffDock: Diffusion Steps, Twists, and Turns for Molecular Docking.</w:t>
+      <w:bookmarkStart w:id="168" w:name="ref-peng2022pocket2mol"/>
+      <w:r>
+        <w:t xml:space="preserve">Peng, X., Luo, S., Guan, J., Xie, Q., Peng, J., &amp; Ma, J. (2022). Pocket2Mol: Efficient Molecular Sampling Based on 3D Protein Pockets.</w:t>
       </w:r>
       <w:r>
         <w:t xml:space="preserve"> </w:t>
@@ -31731,10 +31748,10 @@
           <w:i/>
           <w:iCs/>
         </w:rPr>
-        <w:t xml:space="preserve">ICLR 2023</w:t>
-      </w:r>
-      <w:r>
-        <w:t xml:space="preserve">. arXiv:2210.01776.</w:t>
+        <w:t xml:space="preserve">ICML 2022</w:t>
+      </w:r>
+      <w:r>
+        <w:t xml:space="preserve">. arXiv:2205.07249.</w:t>
       </w:r>
       <w:bookmarkEnd w:id="168"/>
     </w:p>
@@ -31747,9 +31764,9 @@
         </w:numPr>
         <w:ind w:left="180" w:hanging="180"/>
       </w:pPr>
-      <w:bookmarkStart w:id="169" w:name="ref-peng2023moldiff"/>
-      <w:r>
-        <w:t xml:space="preserve">Peng, X., Guan, J., Liu, Q., &amp; Ma, J. (2023). MolDiff: Addressing the Atom-Bond Inconsistency Problem in 3D Molecule Diffusion Generation.</w:t>
+      <w:bookmarkStart w:id="169" w:name="ref-corso2023diffdock"/>
+      <w:r>
+        <w:t xml:space="preserve">Corso, G., Stärk, H., Jing, B., Barzilay, R., &amp; Jaakkola, T. (2023). DiffDock: Diffusion Steps, Twists, and Turns for Molecular Docking.</w:t>
       </w:r>
       <w:r>
         <w:t xml:space="preserve"> </w:t>
@@ -31759,10 +31776,10 @@
           <w:i/>
           <w:iCs/>
         </w:rPr>
-        <w:t xml:space="preserve">ICML 2023</w:t>
-      </w:r>
-      <w:r>
-        <w:t xml:space="preserve">. arXiv:2305.07508.</w:t>
+        <w:t xml:space="preserve">ICLR 2023</w:t>
+      </w:r>
+      <w:r>
+        <w:t xml:space="preserve">. arXiv:2210.01776.</w:t>
       </w:r>
       <w:bookmarkEnd w:id="169"/>
     </w:p>
@@ -31775,9 +31792,9 @@
         </w:numPr>
         <w:ind w:left="180" w:hanging="180"/>
       </w:pPr>
-      <w:bookmarkStart w:id="170" w:name="ref-xu2023geoldm"/>
-      <w:r>
-        <w:t xml:space="preserve">Xu, M., Powers, A., Dror, R. O., Ermon, S., &amp; Leskovec, J. (2023). Geometric Latent Diffusion Models for 3D Molecule Generation.</w:t>
+      <w:bookmarkStart w:id="170" w:name="ref-peng2023moldiff"/>
+      <w:r>
+        <w:t xml:space="preserve">Peng, X., Guan, J., Liu, Q., &amp; Ma, J. (2023). MolDiff: Addressing the Atom-Bond Inconsistency Problem in 3D Molecule Diffusion Generation.</w:t>
       </w:r>
       <w:r>
         <w:t xml:space="preserve"> </w:t>
@@ -31790,7 +31807,7 @@
         <w:t xml:space="preserve">ICML 2023</w:t>
       </w:r>
       <w:r>
-        <w:t xml:space="preserve">. arXiv:2305.01140.</w:t>
+        <w:t xml:space="preserve">. arXiv:2305.07508.</w:t>
       </w:r>
       <w:bookmarkEnd w:id="170"/>
     </w:p>
@@ -31803,9 +31820,9 @@
         </w:numPr>
         <w:ind w:left="180" w:hanging="180"/>
       </w:pPr>
-      <w:bookmarkStart w:id="171" w:name="ref-elton2018applying"/>
-      <w:r>
-        <w:t xml:space="preserve">Elton, D. C., Boukouvalas, Z., Butrico, M. S., Fuge, M. D., &amp; Chung, P. W. (2018). Applying Machine Learning Techniques to Predict the Properties of Energetic Materials.</w:t>
+      <w:bookmarkStart w:id="171" w:name="ref-xu2023geoldm"/>
+      <w:r>
+        <w:t xml:space="preserve">Xu, M., Powers, A., Dror, R. O., Ermon, S., &amp; Leskovec, J. (2023). Geometric Latent Diffusion Models for 3D Molecule Generation.</w:t>
       </w:r>
       <w:r>
         <w:t xml:space="preserve"> </w:t>
@@ -31815,10 +31832,10 @@
           <w:i/>
           <w:iCs/>
         </w:rPr>
-        <w:t xml:space="preserve">Sci. Rep. 8</w:t>
-      </w:r>
-      <w:r>
-        <w:t xml:space="preserve">:9059.</w:t>
+        <w:t xml:space="preserve">ICML 2023</w:t>
+      </w:r>
+      <w:r>
+        <w:t xml:space="preserve">. arXiv:2305.01140.</w:t>
       </w:r>
       <w:bookmarkEnd w:id="171"/>
     </w:p>
@@ -31831,9 +31848,9 @@
         </w:numPr>
         <w:ind w:left="180" w:hanging="180"/>
       </w:pPr>
-      <w:bookmarkStart w:id="172" w:name="ref-politzer2014some"/>
-      <w:r>
-        <w:t xml:space="preserve">Politzer, P., &amp; Murray, J. S. (2014). Some Perspectives on Estimating Detonation Properties of C, H, N, O Compounds.</w:t>
+      <w:bookmarkStart w:id="172" w:name="ref-elton2018applying"/>
+      <w:r>
+        <w:t xml:space="preserve">Elton, D. C., Boukouvalas, Z., Butrico, M. S., Fuge, M. D., &amp; Chung, P. W. (2018). Applying Machine Learning Techniques to Predict the Properties of Energetic Materials.</w:t>
       </w:r>
       <w:r>
         <w:t xml:space="preserve"> </w:t>
@@ -31843,10 +31860,10 @@
           <w:i/>
           <w:iCs/>
         </w:rPr>
-        <w:t xml:space="preserve">Cent. Eur. J. Energ. Mater. 11(4)</w:t>
-      </w:r>
-      <w:r>
-        <w:t xml:space="preserve">:459–474.</w:t>
+        <w:t xml:space="preserve">Sci. Rep. 8</w:t>
+      </w:r>
+      <w:r>
+        <w:t xml:space="preserve">:9059.</w:t>
       </w:r>
       <w:bookmarkEnd w:id="172"/>
     </w:p>
@@ -31859,9 +31876,9 @@
         </w:numPr>
         <w:ind w:left="180" w:hanging="180"/>
       </w:pPr>
-      <w:bookmarkStart w:id="173" w:name="ref-mathieu2017sensitivity"/>
-      <w:r>
-        <w:t xml:space="preserve">Mathieu, D. (2017). Sensitivity of Energetic Materials: Theoretical Relationships to Detonation Performance and Molecular Structure.</w:t>
+      <w:bookmarkStart w:id="173" w:name="ref-politzer2014some"/>
+      <w:r>
+        <w:t xml:space="preserve">Politzer, P., &amp; Murray, J. S. (2014). Some Perspectives on Estimating Detonation Properties of C, H, N, O Compounds.</w:t>
       </w:r>
       <w:r>
         <w:t xml:space="preserve"> </w:t>
@@ -31871,10 +31888,10 @@
           <w:i/>
           <w:iCs/>
         </w:rPr>
-        <w:t xml:space="preserve">Ind. Eng. Chem. Res. 56(31)</w:t>
-      </w:r>
-      <w:r>
-        <w:t xml:space="preserve">:8191–8201. doi:10.1021/acs.iecr.7b02021.</w:t>
+        <w:t xml:space="preserve">Cent. Eur. J. Energ. Mater. 11(4)</w:t>
+      </w:r>
+      <w:r>
+        <w:t xml:space="preserve">:459–474.</w:t>
       </w:r>
       <w:bookmarkEnd w:id="173"/>
     </w:p>
@@ -31887,9 +31904,22 @@
         </w:numPr>
         <w:ind w:left="180" w:hanging="180"/>
       </w:pPr>
-      <w:bookmarkStart w:id="174" w:name="ref-suceska2018explo5"/>
-      <w:r>
-        <w:t xml:space="preserve">Sućeska, M. (2018). EXPLO5 v6.05.04 User's Manual. Brodarski Institute, Zagreb, Croatia. Computer program for calculation of detonation parameters from molecular formula, density, and heat of formation via thermochemical-equilibrium Chapman–Jouguet solver with covolume EOS.</w:t>
+      <w:bookmarkStart w:id="174" w:name="ref-mathieu2017sensitivity"/>
+      <w:r>
+        <w:t xml:space="preserve">Mathieu, D. (2017). Sensitivity of Energetic Materials: Theoretical Relationships to Detonation Performance and Molecular Structure.</w:t>
+      </w:r>
+      <w:r>
+        <w:t xml:space="preserve"> </w:t>
+      </w:r>
+      <w:r>
+        <w:rPr>
+          <w:i/>
+          <w:iCs/>
+        </w:rPr>
+        <w:t xml:space="preserve">Ind. Eng. Chem. Res. 56(31)</w:t>
+      </w:r>
+      <w:r>
+        <w:t xml:space="preserve">:8191–8201. doi:10.1021/acs.iecr.7b02021.</w:t>
       </w:r>
       <w:bookmarkEnd w:id="174"/>
     </w:p>
@@ -31902,9 +31932,9 @@
         </w:numPr>
         <w:ind w:left="180" w:hanging="180"/>
       </w:pPr>
-      <w:bookmarkStart w:id="175" w:name="ref-fried2014cheetah"/>
-      <w:r>
-        <w:t xml:space="preserve">Fried, L. E., Howard, W. M., Souers, P. C., &amp; Vitello, P. A. (2014). Cheetah 7.0 User's Manual. Lawrence Livermore National Laboratory technical report LLNL-SM-664002. Thermochemical-equilibrium detonation code with JCZ3 / BKWS covolume EOS.</w:t>
+      <w:bookmarkStart w:id="175" w:name="ref-suceska2018explo5"/>
+      <w:r>
+        <w:t xml:space="preserve">Sućeska, M. (2018). EXPLO5 v6.05.04 User's Manual. Brodarski Institute, Zagreb, Croatia. Computer program for calculation of detonation parameters from molecular formula, density, and heat of formation via thermochemical-equilibrium Chapman–Jouguet solver with covolume EOS.</w:t>
       </w:r>
       <w:bookmarkEnd w:id="175"/>
     </w:p>
@@ -31917,22 +31947,9 @@
         </w:numPr>
         <w:ind w:left="180" w:hanging="180"/>
       </w:pPr>
-      <w:bookmarkStart w:id="176" w:name="ref-choi2023prep"/>
-      <w:r>
-        <w:t xml:space="preserve">Choi, J. B., Nguyen, P. C. H., Sen, O., Udaykumar, H. S., &amp; Baek, S. (2023). Artificial Intelligence Approaches for Energetic Materials by Design: State of the Art, Challenges, and Future Directions.</w:t>
-      </w:r>
-      <w:r>
-        <w:t xml:space="preserve"> </w:t>
-      </w:r>
-      <w:r>
-        <w:rPr>
-          <w:i/>
-          <w:iCs/>
-        </w:rPr>
-        <w:t xml:space="preserve">Propellants, Explosives, Pyrotechnics 48(4)</w:t>
-      </w:r>
-      <w:r>
-        <w:t xml:space="preserve">, e202200276. doi:10.1002/prep.202200276.</w:t>
+      <w:bookmarkStart w:id="176" w:name="ref-fried2014cheetah"/>
+      <w:r>
+        <w:t xml:space="preserve">Fried, L. E., Howard, W. M., Souers, P. C., &amp; Vitello, P. A. (2014). Cheetah 7.0 User's Manual. Lawrence Livermore National Laboratory technical report LLNL-SM-664002. Thermochemical-equilibrium detonation code with JCZ3 / BKWS covolume EOS.</w:t>
       </w:r>
       <w:bookmarkEnd w:id="176"/>
     </w:p>
@@ -31945,9 +31962,9 @@
         </w:numPr>
         <w:ind w:left="180" w:hanging="180"/>
       </w:pPr>
-      <w:bookmarkStart w:id="177" w:name="ref-mlcrystdens-cm-2024"/>
-      <w:r>
-        <w:t xml:space="preserve">Davis, J. V., Marrs III, F. W., Cawkwell, M. J., &amp; Manner, V. W. (2024). Machine Learning Models for High Explosive Crystal Density and Performance.</w:t>
+      <w:bookmarkStart w:id="177" w:name="ref-choi2023prep"/>
+      <w:r>
+        <w:t xml:space="preserve">Choi, J. B., Nguyen, P. C. H., Sen, O., Udaykumar, H. S., &amp; Baek, S. (2023). Artificial Intelligence Approaches for Energetic Materials by Design: State of the Art, Challenges, and Future Directions.</w:t>
       </w:r>
       <w:r>
         <w:t xml:space="preserve"> </w:t>
@@ -31957,10 +31974,10 @@
           <w:i/>
           <w:iCs/>
         </w:rPr>
-        <w:t xml:space="preserve">Chemistry of Materials 36(22)</w:t>
-      </w:r>
-      <w:r>
-        <w:t xml:space="preserve">, 11109–11118. doi:10.1021/acs.chemmater.4c01978.</w:t>
+        <w:t xml:space="preserve">Propellants, Explosives, Pyrotechnics 48(4)</w:t>
+      </w:r>
+      <w:r>
+        <w:t xml:space="preserve">, e202200276. doi:10.1002/prep.202200276.</w:t>
       </w:r>
       <w:bookmarkEnd w:id="177"/>
     </w:p>
@@ -31973,9 +31990,9 @@
         </w:numPr>
         <w:ind w:left="180" w:hanging="180"/>
       </w:pPr>
-      <w:bookmarkStart w:id="178" w:name="ref-bondi1964vdw"/>
-      <w:r>
-        <w:t xml:space="preserve">Bondi, A. (1964). van der Waals Volumes and Radii.</w:t>
+      <w:bookmarkStart w:id="178" w:name="ref-mlcrystdens-cm-2024"/>
+      <w:r>
+        <w:t xml:space="preserve">Davis, J. V., Marrs III, F. W., Cawkwell, M. J., &amp; Manner, V. W. (2024). Machine Learning Models for High Explosive Crystal Density and Performance.</w:t>
       </w:r>
       <w:r>
         <w:t xml:space="preserve"> </w:t>
@@ -31985,10 +32002,10 @@
           <w:i/>
           <w:iCs/>
         </w:rPr>
-        <w:t xml:space="preserve">J. Phys. Chem. 68(3)</w:t>
-      </w:r>
-      <w:r>
-        <w:t xml:space="preserve">:441–451. doi:10.1021/j100785a001.</w:t>
+        <w:t xml:space="preserve">Chemistry of Materials 36(22)</w:t>
+      </w:r>
+      <w:r>
+        <w:t xml:space="preserve">, 11109–11118. doi:10.1021/acs.chemmater.4c01978.</w:t>
       </w:r>
       <w:bookmarkEnd w:id="178"/>
     </w:p>
@@ -32001,9 +32018,9 @@
         </w:numPr>
         <w:ind w:left="180" w:hanging="180"/>
       </w:pPr>
-      <w:bookmarkStart w:id="179" w:name="ref-nefati1996ann"/>
-      <w:r>
-        <w:t xml:space="preserve">Nefati, H., Cense, J.-M., &amp; Legendre, J.-J. (1996). Prediction of the Impact Sensitivity by Neural Networks.</w:t>
+      <w:bookmarkStart w:id="179" w:name="ref-bondi1964vdw"/>
+      <w:r>
+        <w:t xml:space="preserve">Bondi, A. (1964). van der Waals Volumes and Radii.</w:t>
       </w:r>
       <w:r>
         <w:t xml:space="preserve"> </w:t>
@@ -32013,10 +32030,10 @@
           <w:i/>
           <w:iCs/>
         </w:rPr>
-        <w:t xml:space="preserve">J. Chem. Inf. Comput. Sci. 36(4)</w:t>
-      </w:r>
-      <w:r>
-        <w:t xml:space="preserve">:804–810. doi:10.1021/ci950223m.</w:t>
+        <w:t xml:space="preserve">J. Phys. Chem. 68(3)</w:t>
+      </w:r>
+      <w:r>
+        <w:t xml:space="preserve">:441–451. doi:10.1021/j100785a001.</w:t>
       </w:r>
       <w:bookmarkEnd w:id="179"/>
     </w:p>
@@ -32029,9 +32046,9 @@
         </w:numPr>
         <w:ind w:left="180" w:hanging="180"/>
       </w:pPr>
-      <w:bookmarkStart w:id="180" w:name="ref-huang2021applying"/>
-      <w:r>
-        <w:t xml:space="preserve">Huang, X. et al. (2021). Applying Machine Learning to Balance Performance and Stability of High Energy Density Materials.</w:t>
+      <w:bookmarkStart w:id="180" w:name="ref-nefati1996ann"/>
+      <w:r>
+        <w:t xml:space="preserve">Nefati, H., Cense, J.-M., &amp; Legendre, J.-J. (1996). Prediction of the Impact Sensitivity by Neural Networks.</w:t>
       </w:r>
       <w:r>
         <w:t xml:space="preserve"> </w:t>
@@ -32041,10 +32058,10 @@
           <w:i/>
           <w:iCs/>
         </w:rPr>
-        <w:t xml:space="preserve">iScience 24</w:t>
-      </w:r>
-      <w:r>
-        <w:t xml:space="preserve">:102240.</w:t>
+        <w:t xml:space="preserve">J. Chem. Inf. Comput. Sci. 36(4)</w:t>
+      </w:r>
+      <w:r>
+        <w:t xml:space="preserve">:804–810. doi:10.1021/ci950223m.</w:t>
       </w:r>
       <w:bookmarkEnd w:id="180"/>
     </w:p>
@@ -32057,9 +32074,9 @@
         </w:numPr>
         <w:ind w:left="180" w:hanging="180"/>
       </w:pPr>
-      <w:bookmarkStart w:id="181" w:name="ref-klapotke2017nitrogen"/>
-      <w:r>
-        <w:t xml:space="preserve">Klapötke, T. M.</w:t>
+      <w:bookmarkStart w:id="181" w:name="ref-huang2021applying"/>
+      <w:r>
+        <w:t xml:space="preserve">Huang, X. et al. (2021). Applying Machine Learning to Balance Performance and Stability of High Energy Density Materials.</w:t>
       </w:r>
       <w:r>
         <w:t xml:space="preserve"> </w:t>
@@ -32069,10 +32086,10 @@
           <w:i/>
           <w:iCs/>
         </w:rPr>
-        <w:t xml:space="preserve">Chemistry of High-Energy Materials</w:t>
-      </w:r>
-      <w:r>
-        <w:t xml:space="preserve">, 5th ed. (de Gruyter, 2019). doi:10.1515/9783110624571.</w:t>
+        <w:t xml:space="preserve">iScience 24</w:t>
+      </w:r>
+      <w:r>
+        <w:t xml:space="preserve">:102240.</w:t>
       </w:r>
       <w:bookmarkEnd w:id="181"/>
     </w:p>
@@ -32085,9 +32102,9 @@
         </w:numPr>
         <w:ind w:left="180" w:hanging="180"/>
       </w:pPr>
-      <w:bookmarkStart w:id="182" w:name="ref-griffiths2020constrained"/>
-      <w:r>
-        <w:t xml:space="preserve">Griffiths, R.-R., &amp; Hernández-Lobato, J. M. (2020). Constrained Bayesian optimization for automatic chemical design using variational autoencoders.</w:t>
+      <w:bookmarkStart w:id="182" w:name="ref-klapotke2017nitrogen"/>
+      <w:r>
+        <w:t xml:space="preserve">Klapötke, T. M.</w:t>
       </w:r>
       <w:r>
         <w:t xml:space="preserve"> </w:t>
@@ -32097,10 +32114,10 @@
           <w:i/>
           <w:iCs/>
         </w:rPr>
-        <w:t xml:space="preserve">Chem. Sci. 11(2)</w:t>
-      </w:r>
-      <w:r>
-        <w:t xml:space="preserve">:577–586. doi:10.1039/C9SC04026A.</w:t>
+        <w:t xml:space="preserve">Chemistry of High-Energy Materials</w:t>
+      </w:r>
+      <w:r>
+        <w:t xml:space="preserve">, 5th ed. (de Gruyter, 2019). doi:10.1515/9783110624571.</w:t>
       </w:r>
       <w:bookmarkEnd w:id="182"/>
     </w:p>
@@ -32113,9 +32130,9 @@
         </w:numPr>
         <w:ind w:left="180" w:hanging="180"/>
       </w:pPr>
-      <w:bookmarkStart w:id="183" w:name="ref-npjcompmat2025"/>
-      <w:r>
-        <w:t xml:space="preserve">Liu, J., et al. (2025). De novo multi-objective generation framework for energetic materials with trading off energy and stability.</w:t>
+      <w:bookmarkStart w:id="183" w:name="ref-griffiths2020constrained"/>
+      <w:r>
+        <w:t xml:space="preserve">Griffiths, R.-R., &amp; Hernández-Lobato, J. M. (2020). Constrained Bayesian optimization for automatic chemical design using variational autoencoders.</w:t>
       </w:r>
       <w:r>
         <w:t xml:space="preserve"> </w:t>
@@ -32125,10 +32142,10 @@
           <w:i/>
           <w:iCs/>
         </w:rPr>
-        <w:t xml:space="preserve">npj Computational Materials</w:t>
-      </w:r>
-      <w:r>
-        <w:t xml:space="preserve">. doi:10.1038/s41524-025-01845-6.</w:t>
+        <w:t xml:space="preserve">Chem. Sci. 11(2)</w:t>
+      </w:r>
+      <w:r>
+        <w:t xml:space="preserve">:577–586. doi:10.1039/C9SC04026A.</w:t>
       </w:r>
       <w:bookmarkEnd w:id="183"/>
     </w:p>
@@ -32141,9 +32158,9 @@
         </w:numPr>
         <w:ind w:left="180" w:hanging="180"/>
       </w:pPr>
-      <w:bookmarkStart w:id="184" w:name="ref-yang2019chemprop"/>
-      <w:r>
-        <w:t xml:space="preserve">Yang, K. et al. (2019). Analyzing Learned Molecular Representations for Property Prediction.</w:t>
+      <w:bookmarkStart w:id="184" w:name="ref-npjcompmat2025"/>
+      <w:r>
+        <w:t xml:space="preserve">Liu, J., et al. (2025). De novo multi-objective generation framework for energetic materials with trading off energy and stability.</w:t>
       </w:r>
       <w:r>
         <w:t xml:space="preserve"> </w:t>
@@ -32153,10 +32170,10 @@
           <w:i/>
           <w:iCs/>
         </w:rPr>
-        <w:t xml:space="preserve">J. Chem. Inf. Model. 59(8)</w:t>
-      </w:r>
-      <w:r>
-        <w:t xml:space="preserve">:3370–3388. doi:10.1021/acs.jcim.9b00237.</w:t>
+        <w:t xml:space="preserve">npj Computational Materials</w:t>
+      </w:r>
+      <w:r>
+        <w:t xml:space="preserve">. doi:10.1038/s41524-025-01845-6.</w:t>
       </w:r>
       <w:bookmarkEnd w:id="184"/>
     </w:p>
@@ -32169,9 +32186,9 @@
         </w:numPr>
         <w:ind w:left="180" w:hanging="180"/>
       </w:pPr>
-      <w:bookmarkStart w:id="185" w:name="ref-schutt2018schnet"/>
-      <w:r>
-        <w:t xml:space="preserve">Schütt, K. T., Sauceda, H. E., Kindermans, P.-J., Tkatchenko, A., &amp; Müller, K.-R. (2018). SchNet: A deep learning architecture for molecules and materials.</w:t>
+      <w:bookmarkStart w:id="185" w:name="ref-yang2019chemprop"/>
+      <w:r>
+        <w:t xml:space="preserve">Yang, K. et al. (2019). Analyzing Learned Molecular Representations for Property Prediction.</w:t>
       </w:r>
       <w:r>
         <w:t xml:space="preserve"> </w:t>
@@ -32181,10 +32198,10 @@
           <w:i/>
           <w:iCs/>
         </w:rPr>
-        <w:t xml:space="preserve">J. Chem. Phys. 148</w:t>
-      </w:r>
-      <w:r>
-        <w:t xml:space="preserve">:241722. doi:10.1063/1.5019779.</w:t>
+        <w:t xml:space="preserve">J. Chem. Inf. Model. 59(8)</w:t>
+      </w:r>
+      <w:r>
+        <w:t xml:space="preserve">:3370–3388. doi:10.1021/acs.jcim.9b00237.</w:t>
       </w:r>
       <w:bookmarkEnd w:id="185"/>
     </w:p>
@@ -32197,9 +32214,9 @@
         </w:numPr>
         <w:ind w:left="180" w:hanging="180"/>
       </w:pPr>
-      <w:bookmarkStart w:id="186" w:name="ref-qiao2020orbnet"/>
-      <w:r>
-        <w:t xml:space="preserve">Qiao, Z., Welborn, M., Anandkumar, A., Manby, F. R., &amp; Miller III, T. F. (2020). OrbNet: Deep learning for quantum chemistry using symmetry-adapted atomic-orbital features.</w:t>
+      <w:bookmarkStart w:id="186" w:name="ref-schutt2018schnet"/>
+      <w:r>
+        <w:t xml:space="preserve">Schütt, K. T., Sauceda, H. E., Kindermans, P.-J., Tkatchenko, A., &amp; Müller, K.-R. (2018). SchNet: A deep learning architecture for molecules and materials.</w:t>
       </w:r>
       <w:r>
         <w:t xml:space="preserve"> </w:t>
@@ -32209,10 +32226,10 @@
           <w:i/>
           <w:iCs/>
         </w:rPr>
-        <w:t xml:space="preserve">J. Chem. Phys. 153</w:t>
-      </w:r>
-      <w:r>
-        <w:t xml:space="preserve">:124111. doi:10.1063/5.0021955.</w:t>
+        <w:t xml:space="preserve">J. Chem. Phys. 148</w:t>
+      </w:r>
+      <w:r>
+        <w:t xml:space="preserve">:241722. doi:10.1063/1.5019779.</w:t>
       </w:r>
       <w:bookmarkEnd w:id="186"/>
     </w:p>
@@ -32225,9 +32242,9 @@
         </w:numPr>
         <w:ind w:left="180" w:hanging="180"/>
       </w:pPr>
-      <w:bookmarkStart w:id="187" w:name="ref-polykovskiy2020moses"/>
-      <w:r>
-        <w:t xml:space="preserve">Polykovskiy, D. et al. (2020). Molecular Sets (MOSES): A Benchmarking Platform for Molecular Generation Models.</w:t>
+      <w:bookmarkStart w:id="187" w:name="ref-qiao2020orbnet"/>
+      <w:r>
+        <w:t xml:space="preserve">Qiao, Z., Welborn, M., Anandkumar, A., Manby, F. R., &amp; Miller III, T. F. (2020). OrbNet: Deep learning for quantum chemistry using symmetry-adapted atomic-orbital features.</w:t>
       </w:r>
       <w:r>
         <w:t xml:space="preserve"> </w:t>
@@ -32237,10 +32254,10 @@
           <w:i/>
           <w:iCs/>
         </w:rPr>
-        <w:t xml:space="preserve">Frontiers in Pharmacology 11</w:t>
-      </w:r>
-      <w:r>
-        <w:t xml:space="preserve">:565644. doi:10.3389/fphar.2020.565644.</w:t>
+        <w:t xml:space="preserve">J. Chem. Phys. 153</w:t>
+      </w:r>
+      <w:r>
+        <w:t xml:space="preserve">:124111. doi:10.1063/5.0021955.</w:t>
       </w:r>
       <w:bookmarkEnd w:id="187"/>
     </w:p>
@@ -32253,9 +32270,9 @@
         </w:numPr>
         <w:ind w:left="180" w:hanging="180"/>
       </w:pPr>
-      <w:bookmarkStart w:id="188" w:name="ref-brown2019guacamol"/>
-      <w:r>
-        <w:t xml:space="preserve">Brown, N., Fiscato, M., Segler, M. H. S., &amp; Vaucher, A. C. (2019). GuacaMol: Benchmarking Models for de Novo Molecular Design.</w:t>
+      <w:bookmarkStart w:id="188" w:name="ref-polykovskiy2020moses"/>
+      <w:r>
+        <w:t xml:space="preserve">Polykovskiy, D. et al. (2020). Molecular Sets (MOSES): A Benchmarking Platform for Molecular Generation Models.</w:t>
       </w:r>
       <w:r>
         <w:t xml:space="preserve"> </w:t>
@@ -32265,10 +32282,10 @@
           <w:i/>
           <w:iCs/>
         </w:rPr>
-        <w:t xml:space="preserve">J. Chem. Inf. Model. 59(3)</w:t>
-      </w:r>
-      <w:r>
-        <w:t xml:space="preserve">:1096–1108. doi:10.1021/acs.jcim.8b00839.</w:t>
+        <w:t xml:space="preserve">Frontiers in Pharmacology 11</w:t>
+      </w:r>
+      <w:r>
+        <w:t xml:space="preserve">:565644. doi:10.3389/fphar.2020.565644.</w:t>
       </w:r>
       <w:bookmarkEnd w:id="188"/>
     </w:p>
@@ -32281,9 +32298,9 @@
         </w:numPr>
         <w:ind w:left="180" w:hanging="180"/>
       </w:pPr>
-      <w:bookmarkStart w:id="189" w:name="ref-preuer2018fcd"/>
-      <w:r>
-        <w:t xml:space="preserve">Preuer, K., Renz, P., Unterthiner, T., Hochreiter, S., &amp; Klambauer, G. (2018). Fréchet ChemNet Distance: A Metric for Generative Models for Molecules in Drug Discovery.</w:t>
+      <w:bookmarkStart w:id="189" w:name="ref-brown2019guacamol"/>
+      <w:r>
+        <w:t xml:space="preserve">Brown, N., Fiscato, M., Segler, M. H. S., &amp; Vaucher, A. C. (2019). GuacaMol: Benchmarking Models for de Novo Molecular Design.</w:t>
       </w:r>
       <w:r>
         <w:t xml:space="preserve"> </w:t>
@@ -32293,10 +32310,10 @@
           <w:i/>
           <w:iCs/>
         </w:rPr>
-        <w:t xml:space="preserve">J. Chem. Inf. Model. 58(9)</w:t>
-      </w:r>
-      <w:r>
-        <w:t xml:space="preserve">:1736–1741.</w:t>
+        <w:t xml:space="preserve">J. Chem. Inf. Model. 59(3)</w:t>
+      </w:r>
+      <w:r>
+        <w:t xml:space="preserve">:1096–1108. doi:10.1021/acs.jcim.8b00839.</w:t>
       </w:r>
       <w:bookmarkEnd w:id="189"/>
     </w:p>
@@ -32309,9 +32326,9 @@
         </w:numPr>
         <w:ind w:left="180" w:hanging="180"/>
       </w:pPr>
-      <w:bookmarkStart w:id="190" w:name="ref-reymond2015gdb"/>
-      <w:r>
-        <w:t xml:space="preserve">Reymond, J.-L. (2015). The chemical space project.</w:t>
+      <w:bookmarkStart w:id="190" w:name="ref-preuer2018fcd"/>
+      <w:r>
+        <w:t xml:space="preserve">Preuer, K., Renz, P., Unterthiner, T., Hochreiter, S., &amp; Klambauer, G. (2018). Fréchet ChemNet Distance: A Metric for Generative Models for Molecules in Drug Discovery.</w:t>
       </w:r>
       <w:r>
         <w:t xml:space="preserve"> </w:t>
@@ -32321,10 +32338,10 @@
           <w:i/>
           <w:iCs/>
         </w:rPr>
-        <w:t xml:space="preserve">Acc. Chem. Res. 48(3)</w:t>
-      </w:r>
-      <w:r>
-        <w:t xml:space="preserve">:722–730.</w:t>
+        <w:t xml:space="preserve">J. Chem. Inf. Model. 58(9)</w:t>
+      </w:r>
+      <w:r>
+        <w:t xml:space="preserve">:1736–1741.</w:t>
       </w:r>
       <w:bookmarkEnd w:id="190"/>
     </w:p>
@@ -32337,9 +32354,9 @@
         </w:numPr>
         <w:ind w:left="180" w:hanging="180"/>
       </w:pPr>
-      <w:bookmarkStart w:id="191" w:name="ref-sterling2015zinc"/>
-      <w:r>
-        <w:t xml:space="preserve">Sterling, T., &amp; Irwin, J. J. (2015). ZINC 15: Ligand Discovery for Everyone.</w:t>
+      <w:bookmarkStart w:id="191" w:name="ref-reymond2015gdb"/>
+      <w:r>
+        <w:t xml:space="preserve">Reymond, J.-L. (2015). The chemical space project.</w:t>
       </w:r>
       <w:r>
         <w:t xml:space="preserve"> </w:t>
@@ -32349,10 +32366,10 @@
           <w:i/>
           <w:iCs/>
         </w:rPr>
-        <w:t xml:space="preserve">J. Chem. Inf. Model. 55(11)</w:t>
-      </w:r>
-      <w:r>
-        <w:t xml:space="preserve">:2324–2337.</w:t>
+        <w:t xml:space="preserve">Acc. Chem. Res. 48(3)</w:t>
+      </w:r>
+      <w:r>
+        <w:t xml:space="preserve">:722–730.</w:t>
       </w:r>
       <w:bookmarkEnd w:id="191"/>
     </w:p>
@@ -32365,9 +32382,9 @@
         </w:numPr>
         <w:ind w:left="180" w:hanging="180"/>
       </w:pPr>
-      <w:bookmarkStart w:id="192" w:name="ref-ertl2009sa"/>
-      <w:r>
-        <w:t xml:space="preserve">Ertl, P., &amp; Schuffenhauer, A. (2009). Estimation of Synthetic Accessibility Score of Drug-Like Molecules Based on Molecular Complexity and Fragment Contributions.</w:t>
+      <w:bookmarkStart w:id="192" w:name="ref-sterling2015zinc"/>
+      <w:r>
+        <w:t xml:space="preserve">Sterling, T., &amp; Irwin, J. J. (2015). ZINC 15: Ligand Discovery for Everyone.</w:t>
       </w:r>
       <w:r>
         <w:t xml:space="preserve"> </w:t>
@@ -32377,10 +32394,10 @@
           <w:i/>
           <w:iCs/>
         </w:rPr>
-        <w:t xml:space="preserve">J. Cheminform. 1</w:t>
-      </w:r>
-      <w:r>
-        <w:t xml:space="preserve">:8.</w:t>
+        <w:t xml:space="preserve">J. Chem. Inf. Model. 55(11)</w:t>
+      </w:r>
+      <w:r>
+        <w:t xml:space="preserve">:2324–2337.</w:t>
       </w:r>
       <w:bookmarkEnd w:id="192"/>
     </w:p>
@@ -32393,9 +32410,9 @@
         </w:numPr>
         <w:ind w:left="180" w:hanging="180"/>
       </w:pPr>
-      <w:bookmarkStart w:id="193" w:name="ref-coley2018scscore"/>
-      <w:r>
-        <w:t xml:space="preserve">Coley, C. W., Rogers, L., Green, W. H., &amp; Jensen, K. F. (2018). SCScore: Synthetic Complexity Learned from a Reaction Corpus.</w:t>
+      <w:bookmarkStart w:id="193" w:name="ref-ertl2009sa"/>
+      <w:r>
+        <w:t xml:space="preserve">Ertl, P., &amp; Schuffenhauer, A. (2009). Estimation of Synthetic Accessibility Score of Drug-Like Molecules Based on Molecular Complexity and Fragment Contributions.</w:t>
       </w:r>
       <w:r>
         <w:t xml:space="preserve"> </w:t>
@@ -32405,10 +32422,10 @@
           <w:i/>
           <w:iCs/>
         </w:rPr>
-        <w:t xml:space="preserve">J. Chem. Inf. Model. 58(2)</w:t>
-      </w:r>
-      <w:r>
-        <w:t xml:space="preserve">:252–261.</w:t>
+        <w:t xml:space="preserve">J. Cheminform. 1</w:t>
+      </w:r>
+      <w:r>
+        <w:t xml:space="preserve">:8.</w:t>
       </w:r>
       <w:bookmarkEnd w:id="193"/>
     </w:p>
@@ -32421,9 +32438,9 @@
         </w:numPr>
         <w:ind w:left="180" w:hanging="180"/>
       </w:pPr>
-      <w:bookmarkStart w:id="194" w:name="ref-rogers1960computer"/>
-      <w:r>
-        <w:t xml:space="preserve">Rogers, D. J., &amp; Tanimoto, T. T. (1960). A Computer Program for Classifying Plants.</w:t>
+      <w:bookmarkStart w:id="194" w:name="ref-coley2018scscore"/>
+      <w:r>
+        <w:t xml:space="preserve">Coley, C. W., Rogers, L., Green, W. H., &amp; Jensen, K. F. (2018). SCScore: Synthetic Complexity Learned from a Reaction Corpus.</w:t>
       </w:r>
       <w:r>
         <w:t xml:space="preserve"> </w:t>
@@ -32433,10 +32450,10 @@
           <w:i/>
           <w:iCs/>
         </w:rPr>
-        <w:t xml:space="preserve">Science 132(3434)</w:t>
-      </w:r>
-      <w:r>
-        <w:t xml:space="preserve">:1115–1118.</w:t>
+        <w:t xml:space="preserve">J. Chem. Inf. Model. 58(2)</w:t>
+      </w:r>
+      <w:r>
+        <w:t xml:space="preserve">:252–261.</w:t>
       </w:r>
       <w:bookmarkEnd w:id="194"/>
     </w:p>
@@ -32449,9 +32466,9 @@
         </w:numPr>
         <w:ind w:left="180" w:hanging="180"/>
       </w:pPr>
-      <w:bookmarkStart w:id="195" w:name="ref-bannwarth2019gfn2"/>
-      <w:r>
-        <w:t xml:space="preserve">Bannwarth, C., Ehlert, S., &amp; Grimme, S. (2019). GFN2-xTB: An Accurate and Broadly Parametrized Self-Consistent Tight-Binding Quantum Chemical Method with Multipole Electrostatics and Density-Dependent Dispersion Contributions.</w:t>
+      <w:bookmarkStart w:id="195" w:name="ref-rogers1960computer"/>
+      <w:r>
+        <w:t xml:space="preserve">Rogers, D. J., &amp; Tanimoto, T. T. (1960). A Computer Program for Classifying Plants.</w:t>
       </w:r>
       <w:r>
         <w:t xml:space="preserve"> </w:t>
@@ -32461,10 +32478,10 @@
           <w:i/>
           <w:iCs/>
         </w:rPr>
-        <w:t xml:space="preserve">J. Chem. Theory Comput. 15(3)</w:t>
-      </w:r>
-      <w:r>
-        <w:t xml:space="preserve">:1652–1671. doi:10.1021/acs.jctc.8b01176.</w:t>
+        <w:t xml:space="preserve">Science 132(3434)</w:t>
+      </w:r>
+      <w:r>
+        <w:t xml:space="preserve">:1115–1118.</w:t>
       </w:r>
       <w:bookmarkEnd w:id="195"/>
     </w:p>
@@ -32477,9 +32494,9 @@
         </w:numPr>
         <w:ind w:left="180" w:hanging="180"/>
       </w:pPr>
-      <w:bookmarkStart w:id="196" w:name="ref-sun2020pyscf"/>
-      <w:r>
-        <w:t xml:space="preserve">Sun, Q., Zhang, X., Banerjee, S., Bao, P., et al. (2020). Recent developments in the PySCF program package.</w:t>
+      <w:bookmarkStart w:id="196" w:name="ref-bannwarth2019gfn2"/>
+      <w:r>
+        <w:t xml:space="preserve">Bannwarth, C., Ehlert, S., &amp; Grimme, S. (2019). GFN2-xTB: An Accurate and Broadly Parametrized Self-Consistent Tight-Binding Quantum Chemical Method with Multipole Electrostatics and Density-Dependent Dispersion Contributions.</w:t>
       </w:r>
       <w:r>
         <w:t xml:space="preserve"> </w:t>
@@ -32489,10 +32506,10 @@
           <w:i/>
           <w:iCs/>
         </w:rPr>
-        <w:t xml:space="preserve">J. Chem. Phys. 153</w:t>
-      </w:r>
-      <w:r>
-        <w:t xml:space="preserve">:024109. doi:10.1063/5.0006074.</w:t>
+        <w:t xml:space="preserve">J. Chem. Theory Comput. 15(3)</w:t>
+      </w:r>
+      <w:r>
+        <w:t xml:space="preserve">:1652–1671. doi:10.1021/acs.jctc.8b01176.</w:t>
       </w:r>
       <w:bookmarkEnd w:id="196"/>
     </w:p>
@@ -32505,9 +32522,9 @@
         </w:numPr>
         <w:ind w:left="180" w:hanging="180"/>
       </w:pPr>
-      <w:bookmarkStart w:id="197" w:name="ref-genheden2020aizynth"/>
-      <w:r>
-        <w:t xml:space="preserve">Genheden, S., Thakkar, A., Chadimová, V., Reymond, J.-L., Engkvist, O., &amp; Bjerrum, E. J. (2020). AiZynthFinder: a fast, robust and flexible open-source software for retrosynthetic planning.</w:t>
+      <w:bookmarkStart w:id="197" w:name="ref-sun2020pyscf"/>
+      <w:r>
+        <w:t xml:space="preserve">Sun, Q., Zhang, X., Banerjee, S., Bao, P., et al. (2020). Recent developments in the PySCF program package.</w:t>
       </w:r>
       <w:r>
         <w:t xml:space="preserve"> </w:t>
@@ -32517,10 +32534,10 @@
           <w:i/>
           <w:iCs/>
         </w:rPr>
-        <w:t xml:space="preserve">Journal of Cheminformatics 12</w:t>
-      </w:r>
-      <w:r>
-        <w:t xml:space="preserve">:70. doi:10.1186/s13321-020-00472-1.</w:t>
+        <w:t xml:space="preserve">J. Chem. Phys. 153</w:t>
+      </w:r>
+      <w:r>
+        <w:t xml:space="preserve">:024109. doi:10.1063/5.0006074.</w:t>
       </w:r>
       <w:bookmarkEnd w:id="197"/>
     </w:p>
@@ -32533,9 +32550,9 @@
         </w:numPr>
         <w:ind w:left="180" w:hanging="180"/>
       </w:pPr>
-      <w:bookmarkStart w:id="198" w:name="ref-goerigk2017benchmark"/>
-      <w:r>
-        <w:t xml:space="preserve">Goerigk, L., Hansen, A., Bauer, C., Ehrlich, S., Najibi, A., &amp; Grimme, S. (2017). A look at the density functional theory zoo with the advanced GMTKN55 database for general main group thermochemistry, kinetics and noncovalent interactions.</w:t>
+      <w:bookmarkStart w:id="198" w:name="ref-genheden2020aizynth"/>
+      <w:r>
+        <w:t xml:space="preserve">Genheden, S., Thakkar, A., Chadimová, V., Reymond, J.-L., Engkvist, O., &amp; Bjerrum, E. J. (2020). AiZynthFinder: a fast, robust and flexible open-source software for retrosynthetic planning.</w:t>
       </w:r>
       <w:r>
         <w:t xml:space="preserve"> </w:t>
@@ -32545,10 +32562,10 @@
           <w:i/>
           <w:iCs/>
         </w:rPr>
-        <w:t xml:space="preserve">Phys. Chem. Chem. Phys. 19(48)</w:t>
-      </w:r>
-      <w:r>
-        <w:t xml:space="preserve">:32184–32215. doi:10.1039/C7CP04913G.</w:t>
+        <w:t xml:space="preserve">Journal of Cheminformatics 12</w:t>
+      </w:r>
+      <w:r>
+        <w:t xml:space="preserve">:70. doi:10.1186/s13321-020-00472-1.</w:t>
       </w:r>
       <w:bookmarkEnd w:id="198"/>
     </w:p>
@@ -32561,9 +32578,9 @@
         </w:numPr>
         <w:ind w:left="180" w:hanging="180"/>
       </w:pPr>
-      <w:bookmarkStart w:id="199" w:name="ref-sabatini2018"/>
-      <w:r>
-        <w:t xml:space="preserve">Sabatini, J. J., &amp; Oyler, K. D. (2016). Recent Advances in the Synthesis of High Explosive Materials.</w:t>
+      <w:bookmarkStart w:id="199" w:name="ref-goerigk2017benchmark"/>
+      <w:r>
+        <w:t xml:space="preserve">Goerigk, L., Hansen, A., Bauer, C., Ehrlich, S., Najibi, A., &amp; Grimme, S. (2017). A look at the density functional theory zoo with the advanced GMTKN55 database for general main group thermochemistry, kinetics and noncovalent interactions.</w:t>
       </w:r>
       <w:r>
         <w:t xml:space="preserve"> </w:t>
@@ -32573,13 +32590,10 @@
           <w:i/>
           <w:iCs/>
         </w:rPr>
-        <w:t xml:space="preserve">Crystals</w:t>
-      </w:r>
-      <w:r>
-        <w:t xml:space="preserve"> </w:t>
-      </w:r>
-      <w:r>
-        <w:t xml:space="preserve">6(1):5. doi:10.3390/cryst6010005.</w:t>
+        <w:t xml:space="preserve">Phys. Chem. Chem. Phys. 19(48)</w:t>
+      </w:r>
+      <w:r>
+        <w:t xml:space="preserve">:32184–32215. doi:10.1039/C7CP04913G.</w:t>
       </w:r>
       <w:bookmarkEnd w:id="199"/>
     </w:p>
@@ -32592,9 +32606,9 @@
         </w:numPr>
         <w:ind w:left="180" w:hanging="180"/>
       </w:pPr>
-      <w:bookmarkStart w:id="200" w:name="ref-konnov2025nitroisoxazole"/>
-      <w:r>
-        <w:t xml:space="preserve">Konnov, A. A., Lisyutkin, A. D., Vinogradov, D. B., Nazarova, A. A., Pivkina, A. N., &amp; Fershtat, L. L. (2025). Synthesis of 4-Nitroisoxazole-Based Energetic Materials.</w:t>
+      <w:bookmarkStart w:id="200" w:name="ref-sabatini2018"/>
+      <w:r>
+        <w:t xml:space="preserve">Sabatini, J. J., &amp; Oyler, K. D. (2016). Recent Advances in the Synthesis of High Explosive Materials.</w:t>
       </w:r>
       <w:r>
         <w:t xml:space="preserve"> </w:t>
@@ -32604,10 +32618,13 @@
           <w:i/>
           <w:iCs/>
         </w:rPr>
-        <w:t xml:space="preserve">Org. Lett. 27(14)</w:t>
-      </w:r>
-      <w:r>
-        <w:t xml:space="preserve">:3795–3799. doi:10.1021/acs.orglett.5c01074.</w:t>
+        <w:t xml:space="preserve">Crystals</w:t>
+      </w:r>
+      <w:r>
+        <w:t xml:space="preserve"> </w:t>
+      </w:r>
+      <w:r>
+        <w:t xml:space="preserve">6(1):5. doi:10.3390/cryst6010005.</w:t>
       </w:r>
       <w:bookmarkEnd w:id="200"/>
     </w:p>
@@ -32620,9 +32637,9 @@
         </w:numPr>
         <w:ind w:left="180" w:hanging="180"/>
       </w:pPr>
-      <w:bookmarkStart w:id="201" w:name="ref-herve2010"/>
-      <w:r>
-        <w:t xml:space="preserve">Hervé, G., Roussel, C., &amp; Graindorge, H. (2010). Selective Preparation of 3,4,5-Trinitro-1H-pyrazole: A Stable All-Carbon-Substituted Trinitro Heterocycle, and Related Trinitroisoxazole Chemistry.</w:t>
+      <w:bookmarkStart w:id="201" w:name="ref-konnov2025nitroisoxazole"/>
+      <w:r>
+        <w:t xml:space="preserve">Konnov, A. A., Lisyutkin, A. D., Vinogradov, D. B., Nazarova, A. A., Pivkina, A. N., &amp; Fershtat, L. L. (2025). Synthesis of 4-Nitroisoxazole-Based Energetic Materials.</w:t>
       </w:r>
       <w:r>
         <w:t xml:space="preserve"> </w:t>
@@ -32632,10 +32649,10 @@
           <w:i/>
           <w:iCs/>
         </w:rPr>
-        <w:t xml:space="preserve">Angew. Chem. Int. Ed. 49(18)</w:t>
-      </w:r>
-      <w:r>
-        <w:t xml:space="preserve">:3177–3181. doi:10.1002/anie.201000764.</w:t>
+        <w:t xml:space="preserve">Org. Lett. 27(14)</w:t>
+      </w:r>
+      <w:r>
+        <w:t xml:space="preserve">:3795–3799. doi:10.1021/acs.orglett.5c01074.</w:t>
       </w:r>
       <w:bookmarkEnd w:id="201"/>
     </w:p>
@@ -32648,9 +32665,9 @@
         </w:numPr>
         <w:ind w:left="180" w:hanging="180"/>
       </w:pPr>
-      <w:bookmarkStart w:id="202" w:name="ref-kim2023pubchem"/>
-      <w:r>
-        <w:t xml:space="preserve">Kim, S. et al. (2023). PubChem 2023 Update.</w:t>
+      <w:bookmarkStart w:id="202" w:name="ref-herve2010"/>
+      <w:r>
+        <w:t xml:space="preserve">Hervé, G., Roussel, C., &amp; Graindorge, H. (2010). Selective Preparation of 3,4,5-Trinitro-1H-pyrazole: A Stable All-Carbon-Substituted Trinitro Heterocycle, and Related Trinitroisoxazole Chemistry.</w:t>
       </w:r>
       <w:r>
         <w:t xml:space="preserve"> </w:t>
@@ -32660,10 +32677,10 @@
           <w:i/>
           <w:iCs/>
         </w:rPr>
-        <w:t xml:space="preserve">Nucleic Acids Res. 51(D1)</w:t>
-      </w:r>
-      <w:r>
-        <w:t xml:space="preserve">:D1373–D1380.</w:t>
+        <w:t xml:space="preserve">Angew. Chem. Int. Ed. 49(18)</w:t>
+      </w:r>
+      <w:r>
+        <w:t xml:space="preserve">:3177–3181. doi:10.1002/anie.201000764.</w:t>
       </w:r>
       <w:bookmarkEnd w:id="202"/>
     </w:p>
@@ -32676,9 +32693,9 @@
         </w:numPr>
         <w:ind w:left="180" w:hanging="180"/>
       </w:pPr>
-      <w:bookmarkStart w:id="203" w:name="ref-csp-cgd-2023"/>
-      <w:r>
-        <w:t xml:space="preserve">Arnold, J. E., &amp; Day, G. M. (2023). Crystal Structure Prediction of Energetic Materials.</w:t>
+      <w:bookmarkStart w:id="203" w:name="ref-kim2023pubchem"/>
+      <w:r>
+        <w:t xml:space="preserve">Kim, S. et al. (2023). PubChem 2023 Update.</w:t>
       </w:r>
       <w:r>
         <w:t xml:space="preserve"> </w:t>
@@ -32688,10 +32705,10 @@
           <w:i/>
           <w:iCs/>
         </w:rPr>
-        <w:t xml:space="preserve">Crystal Growth &amp; Design</w:t>
-      </w:r>
-      <w:r>
-        <w:t xml:space="preserve">. doi:10.1021/acs.cgd.3c00706.</w:t>
+        <w:t xml:space="preserve">Nucleic Acids Res. 51(D1)</w:t>
+      </w:r>
+      <w:r>
+        <w:t xml:space="preserve">:D1373–D1380.</w:t>
       </w:r>
       <w:bookmarkEnd w:id="203"/>
     </w:p>
@@ -32704,9 +32721,9 @@
         </w:numPr>
         <w:ind w:left="180" w:hanging="180"/>
       </w:pPr>
-      <w:bookmarkStart w:id="204" w:name="ref-emdb"/>
-      <w:r>
-        <w:t xml:space="preserve">Hand-compilation of measured density, heat of formation, and detonation properties for ~3 000 known energetic CHNO compounds, assembled in this work from secondary literature compilations: Klapötke, T. M.</w:t>
+      <w:bookmarkStart w:id="204" w:name="ref-csp-cgd-2023"/>
+      <w:r>
+        <w:t xml:space="preserve">Arnold, J. E., &amp; Day, G. M. (2023). Crystal Structure Prediction of Energetic Materials.</w:t>
       </w:r>
       <w:r>
         <w:t xml:space="preserve"> </w:t>
@@ -32716,39 +32733,10 @@
           <w:i/>
           <w:iCs/>
         </w:rPr>
-        <w:t xml:space="preserve">Chemistry of High-Energy Materials</w:t>
-      </w:r>
-      <w:r>
-        <w:t xml:space="preserve">, 5th ed. (de Gruyter, 2019); Cooper, P. W.</w:t>
-      </w:r>
-      <w:r>
-        <w:t xml:space="preserve"> </w:t>
-      </w:r>
-      <w:r>
-        <w:rPr>
-          <w:i/>
-          <w:iCs/>
-        </w:rPr>
-        <w:t xml:space="preserve">Explosives Engineering</w:t>
-      </w:r>
-      <w:r>
-        <w:t xml:space="preserve"> </w:t>
-      </w:r>
-      <w:r>
-        <w:t xml:space="preserve">(Wiley-VCH, 1996); and Dobratz, B. M. &amp; Crawford, P. C.</w:t>
-      </w:r>
-      <w:r>
-        <w:t xml:space="preserve"> </w:t>
-      </w:r>
-      <w:r>
-        <w:rPr>
-          <w:i/>
-          <w:iCs/>
-        </w:rPr>
-        <w:t xml:space="preserve">LLNL Explosives Handbook: Properties of Chemical Explosives and Explosive Simulants</w:t>
-      </w:r>
-      <w:r>
-        <w:t xml:space="preserve">, UCRL-52997, Rev. 2 (Lawrence Livermore National Laboratory, 1985). Per-row provenance documented in Supplementary Section A.1.</w:t>
+        <w:t xml:space="preserve">Crystal Growth &amp; Design</w:t>
+      </w:r>
+      <w:r>
+        <w:t xml:space="preserve">. doi:10.1021/acs.cgd.3c00706.</w:t>
       </w:r>
       <w:bookmarkEnd w:id="204"/>
     </w:p>
@@ -32761,7 +32749,64 @@
         </w:numPr>
         <w:ind w:left="180" w:hanging="180"/>
       </w:pPr>
-      <w:bookmarkStart w:id="206" w:name="ref-landrum2024rdkit"/>
+      <w:bookmarkStart w:id="205" w:name="ref-emdb"/>
+      <w:r>
+        <w:t xml:space="preserve">Hand-compilation of measured density, heat of formation, and detonation properties for ~3 000 known energetic CHNO compounds, assembled in this work from secondary literature compilations: Klapötke, T. M.</w:t>
+      </w:r>
+      <w:r>
+        <w:t xml:space="preserve"> </w:t>
+      </w:r>
+      <w:r>
+        <w:rPr>
+          <w:i/>
+          <w:iCs/>
+        </w:rPr>
+        <w:t xml:space="preserve">Chemistry of High-Energy Materials</w:t>
+      </w:r>
+      <w:r>
+        <w:t xml:space="preserve">, 5th ed. (de Gruyter, 2019); Cooper, P. W.</w:t>
+      </w:r>
+      <w:r>
+        <w:t xml:space="preserve"> </w:t>
+      </w:r>
+      <w:r>
+        <w:rPr>
+          <w:i/>
+          <w:iCs/>
+        </w:rPr>
+        <w:t xml:space="preserve">Explosives Engineering</w:t>
+      </w:r>
+      <w:r>
+        <w:t xml:space="preserve"> </w:t>
+      </w:r>
+      <w:r>
+        <w:t xml:space="preserve">(Wiley-VCH, 1996); and Dobratz, B. M. &amp; Crawford, P. C.</w:t>
+      </w:r>
+      <w:r>
+        <w:t xml:space="preserve"> </w:t>
+      </w:r>
+      <w:r>
+        <w:rPr>
+          <w:i/>
+          <w:iCs/>
+        </w:rPr>
+        <w:t xml:space="preserve">LLNL Explosives Handbook: Properties of Chemical Explosives and Explosive Simulants</w:t>
+      </w:r>
+      <w:r>
+        <w:t xml:space="preserve">, UCRL-52997, Rev. 2 (Lawrence Livermore National Laboratory, 1985). Per-row provenance documented in Supplementary Section A.1.</w:t>
+      </w:r>
+      <w:bookmarkEnd w:id="205"/>
+    </w:p>
+    <w:p>
+      <w:pPr>
+        <w:pStyle w:val="MDPI81references"/>
+        <w:numPr>
+          <w:ilvl w:val="0"/>
+          <w:numId w:val="0"/>
+        </w:numPr>
+        <w:ind w:left="180" w:hanging="180"/>
+      </w:pPr>
+      <w:bookmarkStart w:id="207" w:name="ref-landrum2024rdkit"/>
       <w:r>
         <w:t xml:space="preserve">Landrum, G., &amp; contributors. RDKit: Open-source cheminformatics.</w:t>
       </w:r>
@@ -32779,7 +32824,7 @@
       <w:r>
         <w:t xml:space="preserve">.</w:t>
       </w:r>
-      <w:bookmarkEnd w:id="206"/>
+      <w:bookmarkEnd w:id="207"/>
     </w:p>
     <w:p>
       <w:pPr>
@@ -32790,7 +32835,7 @@
         </w:numPr>
         <w:ind w:left="180" w:hanging="180"/>
       </w:pPr>
-      <w:bookmarkStart w:id="207" w:name="ref-bruns2020watson"/>
+      <w:bookmarkStart w:id="208" w:name="ref-bruns2020watson"/>
       <w:r>
         <w:t xml:space="preserve">Bruns, R. F., &amp; Watson, I. A. (2012). Rules for identifying potentially reactive or promiscuous compounds.</w:t>
       </w:r>
@@ -32810,7 +32855,7 @@
       <w:r>
         <w:t xml:space="preserve">55(22):9763–9772. doi:10.1021/jm301008n. Used here as a SMARTS-based reactivity-demerit source.</w:t>
       </w:r>
-      <w:bookmarkEnd w:id="207"/>
+      <w:bookmarkEnd w:id="208"/>
     </w:p>
     <w:p>
       <w:pPr>
@@ -32821,7 +32866,7 @@
         </w:numPr>
         <w:ind w:left="180" w:hanging="180"/>
       </w:pPr>
-      <w:bookmarkStart w:id="209" w:name="ref-daylight-smarts"/>
+      <w:bookmarkStart w:id="210" w:name="ref-daylight-smarts"/>
       <w:r>
         <w:t xml:space="preserve">Daylight Chemical Information Systems. (2007). SMARTS: A Language for Describing Molecular Patterns. Daylight Theory Manual, Aliso Viejo, CA.</w:t>
       </w:r>
@@ -32839,7 +32884,7 @@
       <w:r>
         <w:t xml:space="preserve">. SMARTS = SMILES Arbitrary Target Specification: a pattern language extending SMILES that matches molecular substructures, used by RDKit and other cheminformatics toolkits to evaluate hard-reject catalogs (this work, Section 4.10).</w:t>
       </w:r>
-      <w:bookmarkEnd w:id="209"/>
+      <w:bookmarkEnd w:id="210"/>
     </w:p>
     <w:p>
       <w:pPr>

</xml_diff>

<commit_message>
Polish batch: pool-size tags on F.3, spell out gaming-molecule probe, qualify SI main-text refs
- Tagged the two guidance-invariance ranges by pool: F.3 '9.44-9.51 km/s (pool 10k)'
  vs Table 8/S26 '9.44-9.53 km/s (pool 40k)' so they no longer read as inconsistent.
- Reworded the awkward '7-anchor / 5-gaming-molecule' compound to 'probe of 7 anchors
  and 5 gaming molecules' (4 sites).
- Qualified the four SI references to main-text display items as 'main Table N'/'main
  Figure N' to avoid ambiguity with the SI's own S-series.

Rebuilt molecules + long_paper HTML/docx.

Co-Authored-By: Claude Opus 4.8 <noreply@anthropic.com>
</commit_message>
<xml_diff>
--- a/paper/molecules/molecules_paper.docx
+++ b/paper/molecules/molecules_paper.docx
@@ -17637,10 +17637,10 @@
         <w:tblLook w:val="0420" w:firstRow="1" w:lastRow="0" w:firstColumn="0" w:lastColumn="0" w:noHBand="0" w:noVBand="1"/>
       </w:tblPr>
       <w:tblGrid>
-        <w:gridCol w:w="1518"/>
-        <w:gridCol w:w="1840"/>
-        <w:gridCol w:w="3453"/>
-        <w:gridCol w:w="1047"/>
+        <w:gridCol w:w="1501"/>
+        <w:gridCol w:w="1819"/>
+        <w:gridCol w:w="3502"/>
+        <w:gridCol w:w="1036"/>
       </w:tblGrid>
       <w:tr>
         <w:trPr>
@@ -18179,7 +18179,7 @@
                 <w:sz w:val="18"/>
                 <w:szCs w:val="18"/>
               </w:rPr>
-              <w:t xml:space="preserve">); guidance reduces scaffold count from 12 to 5 (production C2 default).</w:t>
+              <w:t xml:space="preserve">, pool 40k); guidance reduces scaffold count from 12 to 5 (production C2 default).</w:t>
             </w:r>
           </w:p>
         </w:tc>

</xml_diff>